<commit_message>
Harden Unit 2 assessment and final synthesis
Co-authored-by: Cursor <cursoragent@cursor.com>
</commit_message>
<xml_diff>
--- a/production/quizzes/unit-02/unit-2-written-assessment-key.docx
+++ b/production/quizzes/unit-02/unit-2-written-assessment-key.docx
@@ -247,7 +247,7 @@
           <w:color w:val="2F3C7E"/>
           <w:sz w:val="32"/>
         </w:rPr>
-        <w:t>Check Your Thinking (2 points)</w:t>
+        <w:t>Check Your Thinking — BONUS (up to +2)</w:t>
       </w:r>
     </w:p>
     <w:p>
@@ -277,7 +277,7 @@
           <w:color w:val="1F1F1F"/>
           <w:sz w:val="26"/>
         </w:rPr>
-        <w:t>Total: 22 points.</w:t>
+        <w:t>Total: 22 points (+2 bonus).</w:t>
       </w:r>
     </w:p>
     <w:sectPr>

</xml_diff>

<commit_message>
Finalize Unit 2 assessment terminology alignment
Co-authored-by: Cursor <cursoragent@cursor.com>
</commit_message>
<xml_diff>
--- a/production/quizzes/unit-02/unit-2-written-assessment-key.docx
+++ b/production/quizzes/unit-02/unit-2-written-assessment-key.docx
@@ -53,7 +53,7 @@
           <w:b/>
           <w:sz w:val="30"/>
         </w:rPr>
-        <w:t>Part 1: Matching — Answer Key</w:t>
+        <w:t>Section 1: Vocabulary Matching — Answer Key (Questions 1–8 | 16 points)</w:t>
       </w:r>
     </w:p>
     <w:p>
@@ -74,7 +74,7 @@
           <w:b/>
           <w:sz w:val="25"/>
         </w:rPr>
-        <w:t>Generator</w:t>
+        <w:t>Renewable Resource</w:t>
       </w:r>
       <w:r>
         <w:rPr>
@@ -82,7 +82,7 @@
           <w:b w:val="0"/>
           <w:sz w:val="25"/>
         </w:rPr>
-        <w:t xml:space="preserve">  →  B. A machine that changes motion into electricity.</w:t>
+        <w:t xml:space="preserve">  →  F. A natural resource that can be restored or replenished as fast as or faster than it is used.</w:t>
       </w:r>
     </w:p>
     <w:p>
@@ -111,7 +111,7 @@
           <w:b w:val="0"/>
           <w:sz w:val="25"/>
         </w:rPr>
-        <w:t xml:space="preserve">  →  I. A resource that cannot be restored as quickly as it is used.</w:t>
+        <w:t xml:space="preserve">  →  A. A natural resource that cannot be restored as quickly as it is used by humans.</w:t>
       </w:r>
     </w:p>
     <w:p>
@@ -132,7 +132,7 @@
           <w:b/>
           <w:sz w:val="25"/>
         </w:rPr>
-        <w:t>Solar Cell</w:t>
+        <w:t>Fossil Fuel</w:t>
       </w:r>
       <w:r>
         <w:rPr>
@@ -140,7 +140,7 @@
           <w:b w:val="0"/>
           <w:sz w:val="25"/>
         </w:rPr>
-        <w:t xml:space="preserve">  →  J. A device that converts sunlight to electricity.</w:t>
+        <w:t xml:space="preserve">  →  E. An energy-dense fuel formed from the fossilized remains of ancient living organisms.</w:t>
       </w:r>
     </w:p>
     <w:p>
@@ -161,7 +161,7 @@
           <w:b/>
           <w:sz w:val="25"/>
         </w:rPr>
-        <w:t>Fossil Fuel</w:t>
+        <w:t>Petroleum</w:t>
       </w:r>
       <w:r>
         <w:rPr>
@@ -169,7 +169,7 @@
           <w:b w:val="0"/>
           <w:sz w:val="25"/>
         </w:rPr>
-        <w:t xml:space="preserve">  →  D. A fuel formed from the remains of organisms that lived long ago.</w:t>
+        <w:t xml:space="preserve">  →  C. A liquid fossil fuel formed deep underground that is refined into gasoline and diesel.</w:t>
       </w:r>
     </w:p>
     <w:p>
@@ -190,7 +190,7 @@
           <w:b/>
           <w:sz w:val="25"/>
         </w:rPr>
-        <w:t>Turbine</w:t>
+        <w:t>Uranium</w:t>
       </w:r>
       <w:r>
         <w:rPr>
@@ -198,7 +198,7 @@
           <w:b w:val="0"/>
           <w:sz w:val="25"/>
         </w:rPr>
-        <w:t xml:space="preserve">  →  G. A machine with blades that spin when wind, water, or steam pushes them.</w:t>
+        <w:t xml:space="preserve">  →  J. A mined resource used in nuclear power plants to produce heat.</w:t>
       </w:r>
     </w:p>
     <w:p>
@@ -219,7 +219,7 @@
           <w:b/>
           <w:sz w:val="25"/>
         </w:rPr>
-        <w:t>Geothermal Energy</w:t>
+        <w:t>Turbine</w:t>
       </w:r>
       <w:r>
         <w:rPr>
@@ -227,7 +227,7 @@
           <w:b w:val="0"/>
           <w:sz w:val="25"/>
         </w:rPr>
-        <w:t xml:space="preserve">  →  E. Energy produced by heat that is transferred from inside Earth.</w:t>
+        <w:t xml:space="preserve">  →  I. A machine with blades that spins when moving air, water, or steam pushes against it.</w:t>
       </w:r>
     </w:p>
     <w:p>
@@ -248,7 +248,7 @@
           <w:b/>
           <w:sz w:val="25"/>
         </w:rPr>
-        <w:t>Renewable Resource</w:t>
+        <w:t>Generator</w:t>
       </w:r>
       <w:r>
         <w:rPr>
@@ -256,7 +256,7 @@
           <w:b w:val="0"/>
           <w:sz w:val="25"/>
         </w:rPr>
-        <w:t xml:space="preserve">  →  C. A resource that can be restored more quickly than it is used up.</w:t>
+        <w:t xml:space="preserve">  →  B. A machine that helps produce electricity when a turbine spins.</w:t>
       </w:r>
     </w:p>
     <w:p>
@@ -277,7 +277,7 @@
           <w:b/>
           <w:sz w:val="25"/>
         </w:rPr>
-        <w:t>Hydroelectric Power</w:t>
+        <w:t>Solar Energy</w:t>
       </w:r>
       <w:r>
         <w:rPr>
@@ -285,7 +285,61 @@
           <w:b w:val="0"/>
           <w:sz w:val="25"/>
         </w:rPr>
-        <w:t xml:space="preserve">  →  K. Electricity generated by the energy in moving water, usually through a dam.</w:t>
+        <w:t xml:space="preserve">  →  H. Energy from sunlight that can be used to produce electricity.</w:t>
+      </w:r>
+    </w:p>
+    <w:p>
+      <w:pPr>
+        <w:spacing w:after="40" w:before="0"/>
+      </w:pPr>
+      <w:r>
+        <w:rPr>
+          <w:rFonts w:ascii="Calibri" w:hAnsi="Calibri"/>
+          <w:b w:val="0"/>
+          <w:sz w:val="24"/>
+        </w:rPr>
+      </w:r>
+    </w:p>
+    <w:p>
+      <w:pPr>
+        <w:spacing w:after="40" w:before="0"/>
+      </w:pPr>
+      <w:r>
+        <w:rPr>
+          <w:rFonts w:ascii="Calibri" w:hAnsi="Calibri"/>
+          <w:b/>
+          <w:sz w:val="25"/>
+        </w:rPr>
+        <w:t xml:space="preserve">Unused distractor D: </w:t>
+      </w:r>
+      <w:r>
+        <w:rPr>
+          <w:rFonts w:ascii="Calibri" w:hAnsi="Calibri"/>
+          <w:b w:val="0"/>
+          <w:sz w:val="25"/>
+        </w:rPr>
+        <w:t>Heat transferred from Earth's interior.</w:t>
+      </w:r>
+    </w:p>
+    <w:p>
+      <w:pPr>
+        <w:spacing w:after="40" w:before="0"/>
+      </w:pPr>
+      <w:r>
+        <w:rPr>
+          <w:rFonts w:ascii="Calibri" w:hAnsi="Calibri"/>
+          <w:b/>
+          <w:sz w:val="25"/>
+        </w:rPr>
+        <w:t xml:space="preserve">Unused distractor G: </w:t>
+      </w:r>
+      <w:r>
+        <w:rPr>
+          <w:rFonts w:ascii="Calibri" w:hAnsi="Calibri"/>
+          <w:b w:val="0"/>
+          <w:sz w:val="25"/>
+        </w:rPr>
+        <w:t>The energy of moving water flowing through rivers or ocean tides.</w:t>
       </w:r>
     </w:p>
     <w:p>
@@ -310,7 +364,7 @@
           <w:b/>
           <w:sz w:val="30"/>
         </w:rPr>
-        <w:t>Part 2: Multiple Choice — Answer Key</w:t>
+        <w:t>Section 2: Multiple Choice — Answer Key (Questions 9–25 | 34 points)</w:t>
       </w:r>
     </w:p>
     <w:p>
@@ -331,7 +385,7 @@
           <w:b/>
           <w:sz w:val="25"/>
         </w:rPr>
-        <w:t xml:space="preserve">D. </w:t>
+        <w:t xml:space="preserve">C. </w:t>
       </w:r>
       <w:r>
         <w:rPr>
@@ -339,7 +393,7 @@
           <w:b w:val="0"/>
           <w:sz w:val="25"/>
         </w:rPr>
-        <w:t>Nonrenewable, because it forms much more slowly than it is used</w:t>
+        <w:t>Renewable resources can be restored quickly, while nonrenewable resources take millions of years to form.</w:t>
       </w:r>
     </w:p>
     <w:p>
@@ -368,7 +422,7 @@
           <w:b w:val="0"/>
           <w:sz w:val="25"/>
         </w:rPr>
-        <w:t>The remains of organisms that lived long ago</w:t>
+        <w:t>Coal</w:t>
       </w:r>
     </w:p>
     <w:p>
@@ -389,7 +443,7 @@
           <w:b/>
           <w:sz w:val="25"/>
         </w:rPr>
-        <w:t xml:space="preserve">A. </w:t>
+        <w:t xml:space="preserve">B. </w:t>
       </w:r>
       <w:r>
         <w:rPr>
@@ -397,7 +451,7 @@
           <w:b w:val="0"/>
           <w:sz w:val="25"/>
         </w:rPr>
-        <w:t>Plants buried in swamps</w:t>
+        <w:t>They are being used much faster than nature can create them.</w:t>
       </w:r>
     </w:p>
     <w:p>
@@ -418,7 +472,7 @@
           <w:b/>
           <w:sz w:val="25"/>
         </w:rPr>
-        <w:t xml:space="preserve">C. </w:t>
+        <w:t xml:space="preserve">A. </w:t>
       </w:r>
       <w:r>
         <w:rPr>
@@ -426,7 +480,7 @@
           <w:b w:val="0"/>
           <w:sz w:val="25"/>
         </w:rPr>
-        <w:t>Spins a turbine that turns a generator</w:t>
+        <w:t>Petroleum (Crude Oil)</w:t>
       </w:r>
     </w:p>
     <w:p>
@@ -447,7 +501,7 @@
           <w:b/>
           <w:sz w:val="25"/>
         </w:rPr>
-        <w:t xml:space="preserve">B. </w:t>
+        <w:t xml:space="preserve">A. </w:t>
       </w:r>
       <w:r>
         <w:rPr>
@@ -455,7 +509,7 @@
           <w:b w:val="0"/>
           <w:sz w:val="25"/>
         </w:rPr>
-        <w:t>Petroleum (crude oil)</w:t>
+        <w:t>Uranium produces heat that helps create steam</w:t>
       </w:r>
     </w:p>
     <w:p>
@@ -476,7 +530,7 @@
           <w:b/>
           <w:sz w:val="25"/>
         </w:rPr>
-        <w:t xml:space="preserve">D. </w:t>
+        <w:t xml:space="preserve">B. </w:t>
       </w:r>
       <w:r>
         <w:rPr>
@@ -484,7 +538,7 @@
           <w:b w:val="0"/>
           <w:sz w:val="25"/>
         </w:rPr>
-        <w:t>It is a nonrenewable material mined from rock</w:t>
+        <w:t>Electricity</w:t>
       </w:r>
     </w:p>
     <w:p>
@@ -505,7 +559,7 @@
           <w:b/>
           <w:sz w:val="25"/>
         </w:rPr>
-        <w:t xml:space="preserve">C. </w:t>
+        <w:t xml:space="preserve">A. </w:t>
       </w:r>
       <w:r>
         <w:rPr>
@@ -513,7 +567,7 @@
           <w:b w:val="0"/>
           <w:sz w:val="25"/>
         </w:rPr>
-        <w:t>Use heat to make steam that spins a turbine and turns a generator</w:t>
+        <w:t>The energy of moving water pushes a turbine connected to a generator.</w:t>
       </w:r>
     </w:p>
     <w:p>
@@ -534,7 +588,7 @@
           <w:b/>
           <w:sz w:val="25"/>
         </w:rPr>
-        <w:t xml:space="preserve">A. </w:t>
+        <w:t xml:space="preserve">D. </w:t>
       </w:r>
       <w:r>
         <w:rPr>
@@ -542,7 +596,7 @@
           <w:b w:val="0"/>
           <w:sz w:val="25"/>
         </w:rPr>
-        <w:t>Moving air (wind)</w:t>
+        <w:t>Solar power</w:t>
       </w:r>
     </w:p>
     <w:p>
@@ -571,7 +625,7 @@
           <w:b w:val="0"/>
           <w:sz w:val="25"/>
         </w:rPr>
-        <w:t>Wind keeps coming, but it does not blow all the time in every place</w:t>
+        <w:t>Solar energy depends on available sunlight, so less sunlight can limit electricity production.</w:t>
       </w:r>
     </w:p>
     <w:p>
@@ -592,7 +646,7 @@
           <w:b/>
           <w:sz w:val="25"/>
         </w:rPr>
-        <w:t xml:space="preserve">B. </w:t>
+        <w:t xml:space="preserve">D. </w:t>
       </w:r>
       <w:r>
         <w:rPr>
@@ -600,7 +654,7 @@
           <w:b w:val="0"/>
           <w:sz w:val="25"/>
         </w:rPr>
-        <w:t>Moving water flowing through the dam</w:t>
+        <w:t>Deep inside Earth</w:t>
       </w:r>
     </w:p>
     <w:p>
@@ -621,7 +675,7 @@
           <w:b/>
           <w:sz w:val="25"/>
         </w:rPr>
-        <w:t xml:space="preserve">D. </w:t>
+        <w:t xml:space="preserve">A. </w:t>
       </w:r>
       <w:r>
         <w:rPr>
@@ -629,7 +683,7 @@
           <w:b w:val="0"/>
           <w:sz w:val="25"/>
         </w:rPr>
-        <w:t>Water can be stored behind a dam and released when needed</w:t>
+        <w:t>Electricity</w:t>
       </w:r>
     </w:p>
     <w:p>
@@ -650,7 +704,7 @@
           <w:b/>
           <w:sz w:val="25"/>
         </w:rPr>
-        <w:t xml:space="preserve">A. </w:t>
+        <w:t xml:space="preserve">B. </w:t>
       </w:r>
       <w:r>
         <w:rPr>
@@ -658,7 +712,7 @@
           <w:b w:val="0"/>
           <w:sz w:val="25"/>
         </w:rPr>
-        <w:t>It converts sunlight to electricity</w:t>
+        <w:t>Gasoline fuel and battery power</w:t>
       </w:r>
     </w:p>
     <w:p>
@@ -679,7 +733,7 @@
           <w:b/>
           <w:sz w:val="25"/>
         </w:rPr>
-        <w:t xml:space="preserve">B. </w:t>
+        <w:t xml:space="preserve">C. </w:t>
       </w:r>
       <w:r>
         <w:rPr>
@@ -687,7 +741,7 @@
           <w:b w:val="0"/>
           <w:sz w:val="25"/>
         </w:rPr>
-        <w:t>There is no sunlight at night for the solar cell to use</w:t>
+        <w:t>Nonrenewable resource</w:t>
       </w:r>
     </w:p>
     <w:p>
@@ -708,7 +762,7 @@
           <w:b/>
           <w:sz w:val="25"/>
         </w:rPr>
-        <w:t xml:space="preserve">C. </w:t>
+        <w:t xml:space="preserve">A. </w:t>
       </w:r>
       <w:r>
         <w:rPr>
@@ -716,7 +770,7 @@
           <w:b w:val="0"/>
           <w:sz w:val="25"/>
         </w:rPr>
-        <w:t>Heat transferred from inside Earth</w:t>
+        <w:t>Releasing smoke and air pollutants into the air</w:t>
       </w:r>
     </w:p>
     <w:p>
@@ -737,7 +791,7 @@
           <w:b/>
           <w:sz w:val="25"/>
         </w:rPr>
-        <w:t xml:space="preserve">A. </w:t>
+        <w:t xml:space="preserve">B. </w:t>
       </w:r>
       <w:r>
         <w:rPr>
@@ -745,7 +799,7 @@
           <w:b w:val="0"/>
           <w:sz w:val="25"/>
         </w:rPr>
-        <w:t>Geothermal works best in places with heat from Earth near the surface, and not every place has that</w:t>
+        <w:t>A nonrenewable energy resource</w:t>
       </w:r>
     </w:p>
     <w:p>
@@ -766,7 +820,7 @@
           <w:b/>
           <w:sz w:val="25"/>
         </w:rPr>
-        <w:t xml:space="preserve">D. </w:t>
+        <w:t xml:space="preserve">C. </w:t>
       </w:r>
       <w:r>
         <w:rPr>
@@ -774,7 +828,7 @@
           <w:b w:val="0"/>
           <w:sz w:val="25"/>
         </w:rPr>
-        <w:t>Stored energy that can be used again</w:t>
+        <w:t>They both use heat to turn water into steam that spins a turbine generator.</w:t>
       </w:r>
     </w:p>
     <w:p>
@@ -795,7 +849,7 @@
           <w:b/>
           <w:sz w:val="25"/>
         </w:rPr>
-        <w:t xml:space="preserve">C. </w:t>
+        <w:t xml:space="preserve">D. </w:t>
       </w:r>
       <w:r>
         <w:rPr>
@@ -803,7 +857,7 @@
           <w:b w:val="0"/>
           <w:sz w:val="25"/>
         </w:rPr>
-        <w:t>Solar power, because the location has strong sunlight most days</w:t>
+        <w:t>Wind power</w:t>
       </w:r>
     </w:p>
     <w:p>
@@ -828,7 +882,7 @@
           <w:b/>
           <w:sz w:val="30"/>
         </w:rPr>
-        <w:t>Source Alignment</w:t>
+        <w:t>Source Alignment (Reader + Guided Notes)</w:t>
       </w:r>
     </w:p>
     <w:tbl>
@@ -838,14 +892,15 @@
         <w:tblLook w:firstColumn="1" w:firstRow="1" w:lastColumn="0" w:lastRow="0" w:noHBand="0" w:noVBand="1" w:val="04A0"/>
       </w:tblPr>
       <w:tblGrid>
-        <w:gridCol w:w="3312"/>
-        <w:gridCol w:w="3312"/>
-        <w:gridCol w:w="3312"/>
+        <w:gridCol w:w="2484"/>
+        <w:gridCol w:w="2484"/>
+        <w:gridCol w:w="2484"/>
+        <w:gridCol w:w="2484"/>
       </w:tblGrid>
       <w:tr>
         <w:tc>
           <w:tcPr>
-            <w:tcW w:type="dxa" w:w="3312"/>
+            <w:tcW w:type="dxa" w:w="2484"/>
           </w:tcPr>
           <w:p>
             <w:pPr>
@@ -863,7 +918,25 @@
         </w:tc>
         <w:tc>
           <w:tcPr>
-            <w:tcW w:type="dxa" w:w="3312"/>
+            <w:tcW w:type="dxa" w:w="2484"/>
+          </w:tcPr>
+          <w:p>
+            <w:pPr>
+              <w:spacing w:after="40" w:before="40"/>
+            </w:pPr>
+            <w:r>
+              <w:rPr>
+                <w:rFonts w:ascii="Calibri" w:hAnsi="Calibri"/>
+                <w:b/>
+                <w:sz w:val="22"/>
+              </w:rPr>
+              <w:t>Answer</w:t>
+            </w:r>
+          </w:p>
+        </w:tc>
+        <w:tc>
+          <w:tcPr>
+            <w:tcW w:type="dxa" w:w="2484"/>
           </w:tcPr>
           <w:p>
             <w:pPr>
@@ -881,7 +954,7 @@
         </w:tc>
         <w:tc>
           <w:tcPr>
-            <w:tcW w:type="dxa" w:w="3312"/>
+            <w:tcW w:type="dxa" w:w="2484"/>
           </w:tcPr>
           <w:p>
             <w:pPr>
@@ -901,7 +974,7 @@
       <w:tr>
         <w:tc>
           <w:tcPr>
-            <w:tcW w:type="dxa" w:w="3312"/>
+            <w:tcW w:type="dxa" w:w="2484"/>
           </w:tcPr>
           <w:p>
             <w:pPr>
@@ -919,7 +992,7 @@
         </w:tc>
         <w:tc>
           <w:tcPr>
-            <w:tcW w:type="dxa" w:w="3312"/>
+            <w:tcW w:type="dxa" w:w="2484"/>
           </w:tcPr>
           <w:p>
             <w:pPr>
@@ -931,13 +1004,401 @@
                 <w:b w:val="0"/>
                 <w:sz w:val="22"/>
               </w:rPr>
-              <w:t>Ch5 p.28</w:t>
+              <w:t>F</w:t>
             </w:r>
           </w:p>
         </w:tc>
         <w:tc>
           <w:tcPr>
-            <w:tcW w:type="dxa" w:w="3312"/>
+            <w:tcW w:type="dxa" w:w="2484"/>
+          </w:tcPr>
+          <w:p>
+            <w:pPr>
+              <w:spacing w:after="40" w:before="40"/>
+            </w:pPr>
+            <w:r>
+              <w:rPr>
+                <w:rFonts w:ascii="Calibri" w:hAnsi="Calibri"/>
+                <w:b w:val="0"/>
+                <w:sz w:val="22"/>
+              </w:rPr>
+              <w:t>Ch 1</w:t>
+            </w:r>
+          </w:p>
+        </w:tc>
+        <w:tc>
+          <w:tcPr>
+            <w:tcW w:type="dxa" w:w="2484"/>
+          </w:tcPr>
+          <w:p>
+            <w:pPr>
+              <w:spacing w:after="40" w:before="40"/>
+            </w:pPr>
+            <w:r>
+              <w:rPr>
+                <w:rFonts w:ascii="Calibri" w:hAnsi="Calibri"/>
+                <w:b w:val="0"/>
+                <w:sz w:val="22"/>
+              </w:rPr>
+              <w:t>unit-02-ch1 p.1</w:t>
+            </w:r>
+          </w:p>
+        </w:tc>
+      </w:tr>
+      <w:tr>
+        <w:tc>
+          <w:tcPr>
+            <w:tcW w:type="dxa" w:w="2484"/>
+          </w:tcPr>
+          <w:p>
+            <w:pPr>
+              <w:spacing w:after="40" w:before="40"/>
+            </w:pPr>
+            <w:r>
+              <w:rPr>
+                <w:rFonts w:ascii="Calibri" w:hAnsi="Calibri"/>
+                <w:b w:val="0"/>
+                <w:sz w:val="22"/>
+              </w:rPr>
+              <w:t>2</w:t>
+            </w:r>
+          </w:p>
+        </w:tc>
+        <w:tc>
+          <w:tcPr>
+            <w:tcW w:type="dxa" w:w="2484"/>
+          </w:tcPr>
+          <w:p>
+            <w:pPr>
+              <w:spacing w:after="40" w:before="40"/>
+            </w:pPr>
+            <w:r>
+              <w:rPr>
+                <w:rFonts w:ascii="Calibri" w:hAnsi="Calibri"/>
+                <w:b w:val="0"/>
+                <w:sz w:val="22"/>
+              </w:rPr>
+              <w:t>A</w:t>
+            </w:r>
+          </w:p>
+        </w:tc>
+        <w:tc>
+          <w:tcPr>
+            <w:tcW w:type="dxa" w:w="2484"/>
+          </w:tcPr>
+          <w:p>
+            <w:pPr>
+              <w:spacing w:after="40" w:before="40"/>
+            </w:pPr>
+            <w:r>
+              <w:rPr>
+                <w:rFonts w:ascii="Calibri" w:hAnsi="Calibri"/>
+                <w:b w:val="0"/>
+                <w:sz w:val="22"/>
+              </w:rPr>
+              <w:t>Ch 1</w:t>
+            </w:r>
+          </w:p>
+        </w:tc>
+        <w:tc>
+          <w:tcPr>
+            <w:tcW w:type="dxa" w:w="2484"/>
+          </w:tcPr>
+          <w:p>
+            <w:pPr>
+              <w:spacing w:after="40" w:before="40"/>
+            </w:pPr>
+            <w:r>
+              <w:rPr>
+                <w:rFonts w:ascii="Calibri" w:hAnsi="Calibri"/>
+                <w:b w:val="0"/>
+                <w:sz w:val="22"/>
+              </w:rPr>
+              <w:t>unit-02-ch1 p.1</w:t>
+            </w:r>
+          </w:p>
+        </w:tc>
+      </w:tr>
+      <w:tr>
+        <w:tc>
+          <w:tcPr>
+            <w:tcW w:type="dxa" w:w="2484"/>
+          </w:tcPr>
+          <w:p>
+            <w:pPr>
+              <w:spacing w:after="40" w:before="40"/>
+            </w:pPr>
+            <w:r>
+              <w:rPr>
+                <w:rFonts w:ascii="Calibri" w:hAnsi="Calibri"/>
+                <w:b w:val="0"/>
+                <w:sz w:val="22"/>
+              </w:rPr>
+              <w:t>3</w:t>
+            </w:r>
+          </w:p>
+        </w:tc>
+        <w:tc>
+          <w:tcPr>
+            <w:tcW w:type="dxa" w:w="2484"/>
+          </w:tcPr>
+          <w:p>
+            <w:pPr>
+              <w:spacing w:after="40" w:before="40"/>
+            </w:pPr>
+            <w:r>
+              <w:rPr>
+                <w:rFonts w:ascii="Calibri" w:hAnsi="Calibri"/>
+                <w:b w:val="0"/>
+                <w:sz w:val="22"/>
+              </w:rPr>
+              <w:t>E</w:t>
+            </w:r>
+          </w:p>
+        </w:tc>
+        <w:tc>
+          <w:tcPr>
+            <w:tcW w:type="dxa" w:w="2484"/>
+          </w:tcPr>
+          <w:p>
+            <w:pPr>
+              <w:spacing w:after="40" w:before="40"/>
+            </w:pPr>
+            <w:r>
+              <w:rPr>
+                <w:rFonts w:ascii="Calibri" w:hAnsi="Calibri"/>
+                <w:b w:val="0"/>
+                <w:sz w:val="22"/>
+              </w:rPr>
+              <w:t>Ch 2</w:t>
+            </w:r>
+          </w:p>
+        </w:tc>
+        <w:tc>
+          <w:tcPr>
+            <w:tcW w:type="dxa" w:w="2484"/>
+          </w:tcPr>
+          <w:p>
+            <w:pPr>
+              <w:spacing w:after="40" w:before="40"/>
+            </w:pPr>
+            <w:r>
+              <w:rPr>
+                <w:rFonts w:ascii="Calibri" w:hAnsi="Calibri"/>
+                <w:b w:val="0"/>
+                <w:sz w:val="22"/>
+              </w:rPr>
+              <w:t>unit-02-ch1 p.1</w:t>
+            </w:r>
+          </w:p>
+        </w:tc>
+      </w:tr>
+      <w:tr>
+        <w:tc>
+          <w:tcPr>
+            <w:tcW w:type="dxa" w:w="2484"/>
+          </w:tcPr>
+          <w:p>
+            <w:pPr>
+              <w:spacing w:after="40" w:before="40"/>
+            </w:pPr>
+            <w:r>
+              <w:rPr>
+                <w:rFonts w:ascii="Calibri" w:hAnsi="Calibri"/>
+                <w:b w:val="0"/>
+                <w:sz w:val="22"/>
+              </w:rPr>
+              <w:t>4</w:t>
+            </w:r>
+          </w:p>
+        </w:tc>
+        <w:tc>
+          <w:tcPr>
+            <w:tcW w:type="dxa" w:w="2484"/>
+          </w:tcPr>
+          <w:p>
+            <w:pPr>
+              <w:spacing w:after="40" w:before="40"/>
+            </w:pPr>
+            <w:r>
+              <w:rPr>
+                <w:rFonts w:ascii="Calibri" w:hAnsi="Calibri"/>
+                <w:b w:val="0"/>
+                <w:sz w:val="22"/>
+              </w:rPr>
+              <w:t>C</w:t>
+            </w:r>
+          </w:p>
+        </w:tc>
+        <w:tc>
+          <w:tcPr>
+            <w:tcW w:type="dxa" w:w="2484"/>
+          </w:tcPr>
+          <w:p>
+            <w:pPr>
+              <w:spacing w:after="40" w:before="40"/>
+            </w:pPr>
+            <w:r>
+              <w:rPr>
+                <w:rFonts w:ascii="Calibri" w:hAnsi="Calibri"/>
+                <w:b w:val="0"/>
+                <w:sz w:val="22"/>
+              </w:rPr>
+              <w:t>Ch 2</w:t>
+            </w:r>
+          </w:p>
+        </w:tc>
+        <w:tc>
+          <w:tcPr>
+            <w:tcW w:type="dxa" w:w="2484"/>
+          </w:tcPr>
+          <w:p>
+            <w:pPr>
+              <w:spacing w:after="40" w:before="40"/>
+            </w:pPr>
+            <w:r>
+              <w:rPr>
+                <w:rFonts w:ascii="Calibri" w:hAnsi="Calibri"/>
+                <w:b w:val="0"/>
+                <w:sz w:val="22"/>
+              </w:rPr>
+              <w:t>unit-02-ch2 p.1</w:t>
+            </w:r>
+          </w:p>
+        </w:tc>
+      </w:tr>
+      <w:tr>
+        <w:tc>
+          <w:tcPr>
+            <w:tcW w:type="dxa" w:w="2484"/>
+          </w:tcPr>
+          <w:p>
+            <w:pPr>
+              <w:spacing w:after="40" w:before="40"/>
+            </w:pPr>
+            <w:r>
+              <w:rPr>
+                <w:rFonts w:ascii="Calibri" w:hAnsi="Calibri"/>
+                <w:b w:val="0"/>
+                <w:sz w:val="22"/>
+              </w:rPr>
+              <w:t>5</w:t>
+            </w:r>
+          </w:p>
+        </w:tc>
+        <w:tc>
+          <w:tcPr>
+            <w:tcW w:type="dxa" w:w="2484"/>
+          </w:tcPr>
+          <w:p>
+            <w:pPr>
+              <w:spacing w:after="40" w:before="40"/>
+            </w:pPr>
+            <w:r>
+              <w:rPr>
+                <w:rFonts w:ascii="Calibri" w:hAnsi="Calibri"/>
+                <w:b w:val="0"/>
+                <w:sz w:val="22"/>
+              </w:rPr>
+              <w:t>J</w:t>
+            </w:r>
+          </w:p>
+        </w:tc>
+        <w:tc>
+          <w:tcPr>
+            <w:tcW w:type="dxa" w:w="2484"/>
+          </w:tcPr>
+          <w:p>
+            <w:pPr>
+              <w:spacing w:after="40" w:before="40"/>
+            </w:pPr>
+            <w:r>
+              <w:rPr>
+                <w:rFonts w:ascii="Calibri" w:hAnsi="Calibri"/>
+                <w:b w:val="0"/>
+                <w:sz w:val="22"/>
+              </w:rPr>
+              <w:t>Ch 4</w:t>
+            </w:r>
+          </w:p>
+        </w:tc>
+        <w:tc>
+          <w:tcPr>
+            <w:tcW w:type="dxa" w:w="2484"/>
+          </w:tcPr>
+          <w:p>
+            <w:pPr>
+              <w:spacing w:after="40" w:before="40"/>
+            </w:pPr>
+            <w:r>
+              <w:rPr>
+                <w:rFonts w:ascii="Calibri" w:hAnsi="Calibri"/>
+                <w:b w:val="0"/>
+                <w:sz w:val="22"/>
+              </w:rPr>
+              <w:t>unit-02-ch4 p.1</w:t>
+            </w:r>
+          </w:p>
+        </w:tc>
+      </w:tr>
+      <w:tr>
+        <w:tc>
+          <w:tcPr>
+            <w:tcW w:type="dxa" w:w="2484"/>
+          </w:tcPr>
+          <w:p>
+            <w:pPr>
+              <w:spacing w:after="40" w:before="40"/>
+            </w:pPr>
+            <w:r>
+              <w:rPr>
+                <w:rFonts w:ascii="Calibri" w:hAnsi="Calibri"/>
+                <w:b w:val="0"/>
+                <w:sz w:val="22"/>
+              </w:rPr>
+              <w:t>6</w:t>
+            </w:r>
+          </w:p>
+        </w:tc>
+        <w:tc>
+          <w:tcPr>
+            <w:tcW w:type="dxa" w:w="2484"/>
+          </w:tcPr>
+          <w:p>
+            <w:pPr>
+              <w:spacing w:after="40" w:before="40"/>
+            </w:pPr>
+            <w:r>
+              <w:rPr>
+                <w:rFonts w:ascii="Calibri" w:hAnsi="Calibri"/>
+                <w:b w:val="0"/>
+                <w:sz w:val="22"/>
+              </w:rPr>
+              <w:t>I</w:t>
+            </w:r>
+          </w:p>
+        </w:tc>
+        <w:tc>
+          <w:tcPr>
+            <w:tcW w:type="dxa" w:w="2484"/>
+          </w:tcPr>
+          <w:p>
+            <w:pPr>
+              <w:spacing w:after="40" w:before="40"/>
+            </w:pPr>
+            <w:r>
+              <w:rPr>
+                <w:rFonts w:ascii="Calibri" w:hAnsi="Calibri"/>
+                <w:b w:val="0"/>
+                <w:sz w:val="22"/>
+              </w:rPr>
+              <w:t>Ch 5</w:t>
+            </w:r>
+          </w:p>
+        </w:tc>
+        <w:tc>
+          <w:tcPr>
+            <w:tcW w:type="dxa" w:w="2484"/>
           </w:tcPr>
           <w:p>
             <w:pPr>
@@ -957,7 +1418,7 @@
       <w:tr>
         <w:tc>
           <w:tcPr>
-            <w:tcW w:type="dxa" w:w="3312"/>
+            <w:tcW w:type="dxa" w:w="2484"/>
           </w:tcPr>
           <w:p>
             <w:pPr>
@@ -969,13 +1430,13 @@
                 <w:b w:val="0"/>
                 <w:sz w:val="22"/>
               </w:rPr>
-              <w:t>2</w:t>
+              <w:t>7</w:t>
             </w:r>
           </w:p>
         </w:tc>
         <w:tc>
           <w:tcPr>
-            <w:tcW w:type="dxa" w:w="3312"/>
+            <w:tcW w:type="dxa" w:w="2484"/>
           </w:tcPr>
           <w:p>
             <w:pPr>
@@ -987,13 +1448,179 @@
                 <w:b w:val="0"/>
                 <w:sz w:val="22"/>
               </w:rPr>
-              <w:t>Ch1 p.1</w:t>
+              <w:t>B</w:t>
             </w:r>
           </w:p>
         </w:tc>
         <w:tc>
           <w:tcPr>
-            <w:tcW w:type="dxa" w:w="3312"/>
+            <w:tcW w:type="dxa" w:w="2484"/>
+          </w:tcPr>
+          <w:p>
+            <w:pPr>
+              <w:spacing w:after="40" w:before="40"/>
+            </w:pPr>
+            <w:r>
+              <w:rPr>
+                <w:rFonts w:ascii="Calibri" w:hAnsi="Calibri"/>
+                <w:b w:val="0"/>
+                <w:sz w:val="22"/>
+              </w:rPr>
+              <w:t>Ch 3</w:t>
+            </w:r>
+          </w:p>
+        </w:tc>
+        <w:tc>
+          <w:tcPr>
+            <w:tcW w:type="dxa" w:w="2484"/>
+          </w:tcPr>
+          <w:p>
+            <w:pPr>
+              <w:spacing w:after="40" w:before="40"/>
+            </w:pPr>
+            <w:r>
+              <w:rPr>
+                <w:rFonts w:ascii="Calibri" w:hAnsi="Calibri"/>
+                <w:b w:val="0"/>
+                <w:sz w:val="22"/>
+              </w:rPr>
+              <w:t>unit-02-ch3 p.2</w:t>
+            </w:r>
+          </w:p>
+        </w:tc>
+      </w:tr>
+      <w:tr>
+        <w:tc>
+          <w:tcPr>
+            <w:tcW w:type="dxa" w:w="2484"/>
+          </w:tcPr>
+          <w:p>
+            <w:pPr>
+              <w:spacing w:after="40" w:before="40"/>
+            </w:pPr>
+            <w:r>
+              <w:rPr>
+                <w:rFonts w:ascii="Calibri" w:hAnsi="Calibri"/>
+                <w:b w:val="0"/>
+                <w:sz w:val="22"/>
+              </w:rPr>
+              <w:t>8</w:t>
+            </w:r>
+          </w:p>
+        </w:tc>
+        <w:tc>
+          <w:tcPr>
+            <w:tcW w:type="dxa" w:w="2484"/>
+          </w:tcPr>
+          <w:p>
+            <w:pPr>
+              <w:spacing w:after="40" w:before="40"/>
+            </w:pPr>
+            <w:r>
+              <w:rPr>
+                <w:rFonts w:ascii="Calibri" w:hAnsi="Calibri"/>
+                <w:b w:val="0"/>
+                <w:sz w:val="22"/>
+              </w:rPr>
+              <w:t>H</w:t>
+            </w:r>
+          </w:p>
+        </w:tc>
+        <w:tc>
+          <w:tcPr>
+            <w:tcW w:type="dxa" w:w="2484"/>
+          </w:tcPr>
+          <w:p>
+            <w:pPr>
+              <w:spacing w:after="40" w:before="40"/>
+            </w:pPr>
+            <w:r>
+              <w:rPr>
+                <w:rFonts w:ascii="Calibri" w:hAnsi="Calibri"/>
+                <w:b w:val="0"/>
+                <w:sz w:val="22"/>
+              </w:rPr>
+              <w:t>Ch 7</w:t>
+            </w:r>
+          </w:p>
+        </w:tc>
+        <w:tc>
+          <w:tcPr>
+            <w:tcW w:type="dxa" w:w="2484"/>
+          </w:tcPr>
+          <w:p>
+            <w:pPr>
+              <w:spacing w:after="40" w:before="40"/>
+            </w:pPr>
+            <w:r>
+              <w:rPr>
+                <w:rFonts w:ascii="Calibri" w:hAnsi="Calibri"/>
+                <w:b w:val="0"/>
+                <w:sz w:val="22"/>
+              </w:rPr>
+              <w:t>unit-02-ch7 p.1</w:t>
+            </w:r>
+          </w:p>
+        </w:tc>
+      </w:tr>
+      <w:tr>
+        <w:tc>
+          <w:tcPr>
+            <w:tcW w:type="dxa" w:w="2484"/>
+          </w:tcPr>
+          <w:p>
+            <w:pPr>
+              <w:spacing w:after="40" w:before="40"/>
+            </w:pPr>
+            <w:r>
+              <w:rPr>
+                <w:rFonts w:ascii="Calibri" w:hAnsi="Calibri"/>
+                <w:b w:val="0"/>
+                <w:sz w:val="22"/>
+              </w:rPr>
+              <w:t>9</w:t>
+            </w:r>
+          </w:p>
+        </w:tc>
+        <w:tc>
+          <w:tcPr>
+            <w:tcW w:type="dxa" w:w="2484"/>
+          </w:tcPr>
+          <w:p>
+            <w:pPr>
+              <w:spacing w:after="40" w:before="40"/>
+            </w:pPr>
+            <w:r>
+              <w:rPr>
+                <w:rFonts w:ascii="Calibri" w:hAnsi="Calibri"/>
+                <w:b w:val="0"/>
+                <w:sz w:val="22"/>
+              </w:rPr>
+              <w:t>C</w:t>
+            </w:r>
+          </w:p>
+        </w:tc>
+        <w:tc>
+          <w:tcPr>
+            <w:tcW w:type="dxa" w:w="2484"/>
+          </w:tcPr>
+          <w:p>
+            <w:pPr>
+              <w:spacing w:after="40" w:before="40"/>
+            </w:pPr>
+            <w:r>
+              <w:rPr>
+                <w:rFonts w:ascii="Calibri" w:hAnsi="Calibri"/>
+                <w:b w:val="0"/>
+                <w:sz w:val="22"/>
+              </w:rPr>
+              <w:t>Ch 1</w:t>
+            </w:r>
+          </w:p>
+        </w:tc>
+        <w:tc>
+          <w:tcPr>
+            <w:tcW w:type="dxa" w:w="2484"/>
           </w:tcPr>
           <w:p>
             <w:pPr>
@@ -1013,7 +1640,7 @@
       <w:tr>
         <w:tc>
           <w:tcPr>
-            <w:tcW w:type="dxa" w:w="3312"/>
+            <w:tcW w:type="dxa" w:w="2484"/>
           </w:tcPr>
           <w:p>
             <w:pPr>
@@ -1025,13 +1652,13 @@
                 <w:b w:val="0"/>
                 <w:sz w:val="22"/>
               </w:rPr>
-              <w:t>3</w:t>
+              <w:t>10</w:t>
             </w:r>
           </w:p>
         </w:tc>
         <w:tc>
           <w:tcPr>
-            <w:tcW w:type="dxa" w:w="3312"/>
+            <w:tcW w:type="dxa" w:w="2484"/>
           </w:tcPr>
           <w:p>
             <w:pPr>
@@ -1043,13 +1670,13 @@
                 <w:b w:val="0"/>
                 <w:sz w:val="22"/>
               </w:rPr>
-              <w:t>Ch7 p.37</w:t>
+              <w:t>B</w:t>
             </w:r>
           </w:p>
         </w:tc>
         <w:tc>
           <w:tcPr>
-            <w:tcW w:type="dxa" w:w="3312"/>
+            <w:tcW w:type="dxa" w:w="2484"/>
           </w:tcPr>
           <w:p>
             <w:pPr>
@@ -1061,51 +1688,13 @@
                 <w:b w:val="0"/>
                 <w:sz w:val="22"/>
               </w:rPr>
-              <w:t>unit-02-ch7 p.1</w:t>
-            </w:r>
-          </w:p>
-        </w:tc>
-      </w:tr>
-      <w:tr>
-        <w:tc>
-          <w:tcPr>
-            <w:tcW w:type="dxa" w:w="3312"/>
-          </w:tcPr>
-          <w:p>
-            <w:pPr>
-              <w:spacing w:after="40" w:before="40"/>
-            </w:pPr>
-            <w:r>
-              <w:rPr>
-                <w:rFonts w:ascii="Calibri" w:hAnsi="Calibri"/>
-                <w:b w:val="0"/>
-                <w:sz w:val="22"/>
-              </w:rPr>
-              <w:t>4</w:t>
+              <w:t>Ch 1</w:t>
             </w:r>
           </w:p>
         </w:tc>
         <w:tc>
           <w:tcPr>
-            <w:tcW w:type="dxa" w:w="3312"/>
-          </w:tcPr>
-          <w:p>
-            <w:pPr>
-              <w:spacing w:after="40" w:before="40"/>
-            </w:pPr>
-            <w:r>
-              <w:rPr>
-                <w:rFonts w:ascii="Calibri" w:hAnsi="Calibri"/>
-                <w:b w:val="0"/>
-                <w:sz w:val="22"/>
-              </w:rPr>
-              <w:t>Ch2 p.2</w:t>
-            </w:r>
-          </w:p>
-        </w:tc>
-        <w:tc>
-          <w:tcPr>
-            <w:tcW w:type="dxa" w:w="3312"/>
+            <w:tcW w:type="dxa" w:w="2484"/>
           </w:tcPr>
           <w:p>
             <w:pPr>
@@ -1125,7 +1714,7 @@
       <w:tr>
         <w:tc>
           <w:tcPr>
-            <w:tcW w:type="dxa" w:w="3312"/>
+            <w:tcW w:type="dxa" w:w="2484"/>
           </w:tcPr>
           <w:p>
             <w:pPr>
@@ -1137,13 +1726,13 @@
                 <w:b w:val="0"/>
                 <w:sz w:val="22"/>
               </w:rPr>
-              <w:t>5</w:t>
+              <w:t>11</w:t>
             </w:r>
           </w:p>
         </w:tc>
         <w:tc>
           <w:tcPr>
-            <w:tcW w:type="dxa" w:w="3312"/>
+            <w:tcW w:type="dxa" w:w="2484"/>
           </w:tcPr>
           <w:p>
             <w:pPr>
@@ -1155,13 +1744,253 @@
                 <w:b w:val="0"/>
                 <w:sz w:val="22"/>
               </w:rPr>
-              <w:t>Ch5 p.28</w:t>
+              <w:t>B</w:t>
             </w:r>
           </w:p>
         </w:tc>
         <w:tc>
           <w:tcPr>
-            <w:tcW w:type="dxa" w:w="3312"/>
+            <w:tcW w:type="dxa" w:w="2484"/>
+          </w:tcPr>
+          <w:p>
+            <w:pPr>
+              <w:spacing w:after="40" w:before="40"/>
+            </w:pPr>
+            <w:r>
+              <w:rPr>
+                <w:rFonts w:ascii="Calibri" w:hAnsi="Calibri"/>
+                <w:b w:val="0"/>
+                <w:sz w:val="22"/>
+              </w:rPr>
+              <w:t>Ch 1</w:t>
+            </w:r>
+          </w:p>
+        </w:tc>
+        <w:tc>
+          <w:tcPr>
+            <w:tcW w:type="dxa" w:w="2484"/>
+          </w:tcPr>
+          <w:p>
+            <w:pPr>
+              <w:spacing w:after="40" w:before="40"/>
+            </w:pPr>
+            <w:r>
+              <w:rPr>
+                <w:rFonts w:ascii="Calibri" w:hAnsi="Calibri"/>
+                <w:b w:val="0"/>
+                <w:sz w:val="22"/>
+              </w:rPr>
+              <w:t>unit-02-ch1 p.1</w:t>
+            </w:r>
+          </w:p>
+        </w:tc>
+      </w:tr>
+      <w:tr>
+        <w:tc>
+          <w:tcPr>
+            <w:tcW w:type="dxa" w:w="2484"/>
+          </w:tcPr>
+          <w:p>
+            <w:pPr>
+              <w:spacing w:after="40" w:before="40"/>
+            </w:pPr>
+            <w:r>
+              <w:rPr>
+                <w:rFonts w:ascii="Calibri" w:hAnsi="Calibri"/>
+                <w:b w:val="0"/>
+                <w:sz w:val="22"/>
+              </w:rPr>
+              <w:t>12</w:t>
+            </w:r>
+          </w:p>
+        </w:tc>
+        <w:tc>
+          <w:tcPr>
+            <w:tcW w:type="dxa" w:w="2484"/>
+          </w:tcPr>
+          <w:p>
+            <w:pPr>
+              <w:spacing w:after="40" w:before="40"/>
+            </w:pPr>
+            <w:r>
+              <w:rPr>
+                <w:rFonts w:ascii="Calibri" w:hAnsi="Calibri"/>
+                <w:b w:val="0"/>
+                <w:sz w:val="22"/>
+              </w:rPr>
+              <w:t>A</w:t>
+            </w:r>
+          </w:p>
+        </w:tc>
+        <w:tc>
+          <w:tcPr>
+            <w:tcW w:type="dxa" w:w="2484"/>
+          </w:tcPr>
+          <w:p>
+            <w:pPr>
+              <w:spacing w:after="40" w:before="40"/>
+            </w:pPr>
+            <w:r>
+              <w:rPr>
+                <w:rFonts w:ascii="Calibri" w:hAnsi="Calibri"/>
+                <w:b w:val="0"/>
+                <w:sz w:val="22"/>
+              </w:rPr>
+              <w:t>Ch 2</w:t>
+            </w:r>
+          </w:p>
+        </w:tc>
+        <w:tc>
+          <w:tcPr>
+            <w:tcW w:type="dxa" w:w="2484"/>
+          </w:tcPr>
+          <w:p>
+            <w:pPr>
+              <w:spacing w:after="40" w:before="40"/>
+            </w:pPr>
+            <w:r>
+              <w:rPr>
+                <w:rFonts w:ascii="Calibri" w:hAnsi="Calibri"/>
+                <w:b w:val="0"/>
+                <w:sz w:val="22"/>
+              </w:rPr>
+              <w:t>unit-02-ch2 p.1</w:t>
+            </w:r>
+          </w:p>
+        </w:tc>
+      </w:tr>
+      <w:tr>
+        <w:tc>
+          <w:tcPr>
+            <w:tcW w:type="dxa" w:w="2484"/>
+          </w:tcPr>
+          <w:p>
+            <w:pPr>
+              <w:spacing w:after="40" w:before="40"/>
+            </w:pPr>
+            <w:r>
+              <w:rPr>
+                <w:rFonts w:ascii="Calibri" w:hAnsi="Calibri"/>
+                <w:b w:val="0"/>
+                <w:sz w:val="22"/>
+              </w:rPr>
+              <w:t>13</w:t>
+            </w:r>
+          </w:p>
+        </w:tc>
+        <w:tc>
+          <w:tcPr>
+            <w:tcW w:type="dxa" w:w="2484"/>
+          </w:tcPr>
+          <w:p>
+            <w:pPr>
+              <w:spacing w:after="40" w:before="40"/>
+            </w:pPr>
+            <w:r>
+              <w:rPr>
+                <w:rFonts w:ascii="Calibri" w:hAnsi="Calibri"/>
+                <w:b w:val="0"/>
+                <w:sz w:val="22"/>
+              </w:rPr>
+              <w:t>A</w:t>
+            </w:r>
+          </w:p>
+        </w:tc>
+        <w:tc>
+          <w:tcPr>
+            <w:tcW w:type="dxa" w:w="2484"/>
+          </w:tcPr>
+          <w:p>
+            <w:pPr>
+              <w:spacing w:after="40" w:before="40"/>
+            </w:pPr>
+            <w:r>
+              <w:rPr>
+                <w:rFonts w:ascii="Calibri" w:hAnsi="Calibri"/>
+                <w:b w:val="0"/>
+                <w:sz w:val="22"/>
+              </w:rPr>
+              <w:t>Ch 4</w:t>
+            </w:r>
+          </w:p>
+        </w:tc>
+        <w:tc>
+          <w:tcPr>
+            <w:tcW w:type="dxa" w:w="2484"/>
+          </w:tcPr>
+          <w:p>
+            <w:pPr>
+              <w:spacing w:after="40" w:before="40"/>
+            </w:pPr>
+            <w:r>
+              <w:rPr>
+                <w:rFonts w:ascii="Calibri" w:hAnsi="Calibri"/>
+                <w:b w:val="0"/>
+                <w:sz w:val="22"/>
+              </w:rPr>
+              <w:t>unit-02-ch4 p.1</w:t>
+            </w:r>
+          </w:p>
+        </w:tc>
+      </w:tr>
+      <w:tr>
+        <w:tc>
+          <w:tcPr>
+            <w:tcW w:type="dxa" w:w="2484"/>
+          </w:tcPr>
+          <w:p>
+            <w:pPr>
+              <w:spacing w:after="40" w:before="40"/>
+            </w:pPr>
+            <w:r>
+              <w:rPr>
+                <w:rFonts w:ascii="Calibri" w:hAnsi="Calibri"/>
+                <w:b w:val="0"/>
+                <w:sz w:val="22"/>
+              </w:rPr>
+              <w:t>14</w:t>
+            </w:r>
+          </w:p>
+        </w:tc>
+        <w:tc>
+          <w:tcPr>
+            <w:tcW w:type="dxa" w:w="2484"/>
+          </w:tcPr>
+          <w:p>
+            <w:pPr>
+              <w:spacing w:after="40" w:before="40"/>
+            </w:pPr>
+            <w:r>
+              <w:rPr>
+                <w:rFonts w:ascii="Calibri" w:hAnsi="Calibri"/>
+                <w:b w:val="0"/>
+                <w:sz w:val="22"/>
+              </w:rPr>
+              <w:t>B</w:t>
+            </w:r>
+          </w:p>
+        </w:tc>
+        <w:tc>
+          <w:tcPr>
+            <w:tcW w:type="dxa" w:w="2484"/>
+          </w:tcPr>
+          <w:p>
+            <w:pPr>
+              <w:spacing w:after="40" w:before="40"/>
+            </w:pPr>
+            <w:r>
+              <w:rPr>
+                <w:rFonts w:ascii="Calibri" w:hAnsi="Calibri"/>
+                <w:b w:val="0"/>
+                <w:sz w:val="22"/>
+              </w:rPr>
+              <w:t>Ch 5</w:t>
+            </w:r>
+          </w:p>
+        </w:tc>
+        <w:tc>
+          <w:tcPr>
+            <w:tcW w:type="dxa" w:w="2484"/>
           </w:tcPr>
           <w:p>
             <w:pPr>
@@ -1181,7 +2010,7 @@
       <w:tr>
         <w:tc>
           <w:tcPr>
-            <w:tcW w:type="dxa" w:w="3312"/>
+            <w:tcW w:type="dxa" w:w="2484"/>
           </w:tcPr>
           <w:p>
             <w:pPr>
@@ -1193,13 +2022,13 @@
                 <w:b w:val="0"/>
                 <w:sz w:val="22"/>
               </w:rPr>
-              <w:t>6</w:t>
+              <w:t>15</w:t>
             </w:r>
           </w:p>
         </w:tc>
         <w:tc>
           <w:tcPr>
-            <w:tcW w:type="dxa" w:w="3312"/>
+            <w:tcW w:type="dxa" w:w="2484"/>
           </w:tcPr>
           <w:p>
             <w:pPr>
@@ -1211,13 +2040,253 @@
                 <w:b w:val="0"/>
                 <w:sz w:val="22"/>
               </w:rPr>
-              <w:t>Ch8 p.43</w:t>
+              <w:t>A</w:t>
             </w:r>
           </w:p>
         </w:tc>
         <w:tc>
           <w:tcPr>
-            <w:tcW w:type="dxa" w:w="3312"/>
+            <w:tcW w:type="dxa" w:w="2484"/>
+          </w:tcPr>
+          <w:p>
+            <w:pPr>
+              <w:spacing w:after="40" w:before="40"/>
+            </w:pPr>
+            <w:r>
+              <w:rPr>
+                <w:rFonts w:ascii="Calibri" w:hAnsi="Calibri"/>
+                <w:b w:val="0"/>
+                <w:sz w:val="22"/>
+              </w:rPr>
+              <w:t>Ch 6</w:t>
+            </w:r>
+          </w:p>
+        </w:tc>
+        <w:tc>
+          <w:tcPr>
+            <w:tcW w:type="dxa" w:w="2484"/>
+          </w:tcPr>
+          <w:p>
+            <w:pPr>
+              <w:spacing w:after="40" w:before="40"/>
+            </w:pPr>
+            <w:r>
+              <w:rPr>
+                <w:rFonts w:ascii="Calibri" w:hAnsi="Calibri"/>
+                <w:b w:val="0"/>
+                <w:sz w:val="22"/>
+              </w:rPr>
+              <w:t>unit-02-ch6 p.1</w:t>
+            </w:r>
+          </w:p>
+        </w:tc>
+      </w:tr>
+      <w:tr>
+        <w:tc>
+          <w:tcPr>
+            <w:tcW w:type="dxa" w:w="2484"/>
+          </w:tcPr>
+          <w:p>
+            <w:pPr>
+              <w:spacing w:after="40" w:before="40"/>
+            </w:pPr>
+            <w:r>
+              <w:rPr>
+                <w:rFonts w:ascii="Calibri" w:hAnsi="Calibri"/>
+                <w:b w:val="0"/>
+                <w:sz w:val="22"/>
+              </w:rPr>
+              <w:t>16</w:t>
+            </w:r>
+          </w:p>
+        </w:tc>
+        <w:tc>
+          <w:tcPr>
+            <w:tcW w:type="dxa" w:w="2484"/>
+          </w:tcPr>
+          <w:p>
+            <w:pPr>
+              <w:spacing w:after="40" w:before="40"/>
+            </w:pPr>
+            <w:r>
+              <w:rPr>
+                <w:rFonts w:ascii="Calibri" w:hAnsi="Calibri"/>
+                <w:b w:val="0"/>
+                <w:sz w:val="22"/>
+              </w:rPr>
+              <w:t>D</w:t>
+            </w:r>
+          </w:p>
+        </w:tc>
+        <w:tc>
+          <w:tcPr>
+            <w:tcW w:type="dxa" w:w="2484"/>
+          </w:tcPr>
+          <w:p>
+            <w:pPr>
+              <w:spacing w:after="40" w:before="40"/>
+            </w:pPr>
+            <w:r>
+              <w:rPr>
+                <w:rFonts w:ascii="Calibri" w:hAnsi="Calibri"/>
+                <w:b w:val="0"/>
+                <w:sz w:val="22"/>
+              </w:rPr>
+              <w:t>Ch 7</w:t>
+            </w:r>
+          </w:p>
+        </w:tc>
+        <w:tc>
+          <w:tcPr>
+            <w:tcW w:type="dxa" w:w="2484"/>
+          </w:tcPr>
+          <w:p>
+            <w:pPr>
+              <w:spacing w:after="40" w:before="40"/>
+            </w:pPr>
+            <w:r>
+              <w:rPr>
+                <w:rFonts w:ascii="Calibri" w:hAnsi="Calibri"/>
+                <w:b w:val="0"/>
+                <w:sz w:val="22"/>
+              </w:rPr>
+              <w:t>unit-02-ch7 p.2</w:t>
+            </w:r>
+          </w:p>
+        </w:tc>
+      </w:tr>
+      <w:tr>
+        <w:tc>
+          <w:tcPr>
+            <w:tcW w:type="dxa" w:w="2484"/>
+          </w:tcPr>
+          <w:p>
+            <w:pPr>
+              <w:spacing w:after="40" w:before="40"/>
+            </w:pPr>
+            <w:r>
+              <w:rPr>
+                <w:rFonts w:ascii="Calibri" w:hAnsi="Calibri"/>
+                <w:b w:val="0"/>
+                <w:sz w:val="22"/>
+              </w:rPr>
+              <w:t>17</w:t>
+            </w:r>
+          </w:p>
+        </w:tc>
+        <w:tc>
+          <w:tcPr>
+            <w:tcW w:type="dxa" w:w="2484"/>
+          </w:tcPr>
+          <w:p>
+            <w:pPr>
+              <w:spacing w:after="40" w:before="40"/>
+            </w:pPr>
+            <w:r>
+              <w:rPr>
+                <w:rFonts w:ascii="Calibri" w:hAnsi="Calibri"/>
+                <w:b w:val="0"/>
+                <w:sz w:val="22"/>
+              </w:rPr>
+              <w:t>C</w:t>
+            </w:r>
+          </w:p>
+        </w:tc>
+        <w:tc>
+          <w:tcPr>
+            <w:tcW w:type="dxa" w:w="2484"/>
+          </w:tcPr>
+          <w:p>
+            <w:pPr>
+              <w:spacing w:after="40" w:before="40"/>
+            </w:pPr>
+            <w:r>
+              <w:rPr>
+                <w:rFonts w:ascii="Calibri" w:hAnsi="Calibri"/>
+                <w:b w:val="0"/>
+                <w:sz w:val="22"/>
+              </w:rPr>
+              <w:t>Ch 7</w:t>
+            </w:r>
+          </w:p>
+        </w:tc>
+        <w:tc>
+          <w:tcPr>
+            <w:tcW w:type="dxa" w:w="2484"/>
+          </w:tcPr>
+          <w:p>
+            <w:pPr>
+              <w:spacing w:after="40" w:before="40"/>
+            </w:pPr>
+            <w:r>
+              <w:rPr>
+                <w:rFonts w:ascii="Calibri" w:hAnsi="Calibri"/>
+                <w:b w:val="0"/>
+                <w:sz w:val="22"/>
+              </w:rPr>
+              <w:t>unit-02-ch7 p.2</w:t>
+            </w:r>
+          </w:p>
+        </w:tc>
+      </w:tr>
+      <w:tr>
+        <w:tc>
+          <w:tcPr>
+            <w:tcW w:type="dxa" w:w="2484"/>
+          </w:tcPr>
+          <w:p>
+            <w:pPr>
+              <w:spacing w:after="40" w:before="40"/>
+            </w:pPr>
+            <w:r>
+              <w:rPr>
+                <w:rFonts w:ascii="Calibri" w:hAnsi="Calibri"/>
+                <w:b w:val="0"/>
+                <w:sz w:val="22"/>
+              </w:rPr>
+              <w:t>18</w:t>
+            </w:r>
+          </w:p>
+        </w:tc>
+        <w:tc>
+          <w:tcPr>
+            <w:tcW w:type="dxa" w:w="2484"/>
+          </w:tcPr>
+          <w:p>
+            <w:pPr>
+              <w:spacing w:after="40" w:before="40"/>
+            </w:pPr>
+            <w:r>
+              <w:rPr>
+                <w:rFonts w:ascii="Calibri" w:hAnsi="Calibri"/>
+                <w:b w:val="0"/>
+                <w:sz w:val="22"/>
+              </w:rPr>
+              <w:t>D</w:t>
+            </w:r>
+          </w:p>
+        </w:tc>
+        <w:tc>
+          <w:tcPr>
+            <w:tcW w:type="dxa" w:w="2484"/>
+          </w:tcPr>
+          <w:p>
+            <w:pPr>
+              <w:spacing w:after="40" w:before="40"/>
+            </w:pPr>
+            <w:r>
+              <w:rPr>
+                <w:rFonts w:ascii="Calibri" w:hAnsi="Calibri"/>
+                <w:b w:val="0"/>
+                <w:sz w:val="22"/>
+              </w:rPr>
+              <w:t>Ch 8</w:t>
+            </w:r>
+          </w:p>
+        </w:tc>
+        <w:tc>
+          <w:tcPr>
+            <w:tcW w:type="dxa" w:w="2484"/>
           </w:tcPr>
           <w:p>
             <w:pPr>
@@ -1237,7 +2306,7 @@
       <w:tr>
         <w:tc>
           <w:tcPr>
-            <w:tcW w:type="dxa" w:w="3312"/>
+            <w:tcW w:type="dxa" w:w="2484"/>
           </w:tcPr>
           <w:p>
             <w:pPr>
@@ -1249,13 +2318,13 @@
                 <w:b w:val="0"/>
                 <w:sz w:val="22"/>
               </w:rPr>
-              <w:t>7</w:t>
+              <w:t>19</w:t>
             </w:r>
           </w:p>
         </w:tc>
         <w:tc>
           <w:tcPr>
-            <w:tcW w:type="dxa" w:w="3312"/>
+            <w:tcW w:type="dxa" w:w="2484"/>
           </w:tcPr>
           <w:p>
             <w:pPr>
@@ -1267,13 +2336,179 @@
                 <w:b w:val="0"/>
                 <w:sz w:val="22"/>
               </w:rPr>
-              <w:t>Ch1 p.1</w:t>
+              <w:t>A</w:t>
             </w:r>
           </w:p>
         </w:tc>
         <w:tc>
           <w:tcPr>
-            <w:tcW w:type="dxa" w:w="3312"/>
+            <w:tcW w:type="dxa" w:w="2484"/>
+          </w:tcPr>
+          <w:p>
+            <w:pPr>
+              <w:spacing w:after="40" w:before="40"/>
+            </w:pPr>
+            <w:r>
+              <w:rPr>
+                <w:rFonts w:ascii="Calibri" w:hAnsi="Calibri"/>
+                <w:b w:val="0"/>
+                <w:sz w:val="22"/>
+              </w:rPr>
+              <w:t>Ch 3</w:t>
+            </w:r>
+          </w:p>
+        </w:tc>
+        <w:tc>
+          <w:tcPr>
+            <w:tcW w:type="dxa" w:w="2484"/>
+          </w:tcPr>
+          <w:p>
+            <w:pPr>
+              <w:spacing w:after="40" w:before="40"/>
+            </w:pPr>
+            <w:r>
+              <w:rPr>
+                <w:rFonts w:ascii="Calibri" w:hAnsi="Calibri"/>
+                <w:b w:val="0"/>
+                <w:sz w:val="22"/>
+              </w:rPr>
+              <w:t>unit-02-ch3 p.2</w:t>
+            </w:r>
+          </w:p>
+        </w:tc>
+      </w:tr>
+      <w:tr>
+        <w:tc>
+          <w:tcPr>
+            <w:tcW w:type="dxa" w:w="2484"/>
+          </w:tcPr>
+          <w:p>
+            <w:pPr>
+              <w:spacing w:after="40" w:before="40"/>
+            </w:pPr>
+            <w:r>
+              <w:rPr>
+                <w:rFonts w:ascii="Calibri" w:hAnsi="Calibri"/>
+                <w:b w:val="0"/>
+                <w:sz w:val="22"/>
+              </w:rPr>
+              <w:t>20</w:t>
+            </w:r>
+          </w:p>
+        </w:tc>
+        <w:tc>
+          <w:tcPr>
+            <w:tcW w:type="dxa" w:w="2484"/>
+          </w:tcPr>
+          <w:p>
+            <w:pPr>
+              <w:spacing w:after="40" w:before="40"/>
+            </w:pPr>
+            <w:r>
+              <w:rPr>
+                <w:rFonts w:ascii="Calibri" w:hAnsi="Calibri"/>
+                <w:b w:val="0"/>
+                <w:sz w:val="22"/>
+              </w:rPr>
+              <w:t>B</w:t>
+            </w:r>
+          </w:p>
+        </w:tc>
+        <w:tc>
+          <w:tcPr>
+            <w:tcW w:type="dxa" w:w="2484"/>
+          </w:tcPr>
+          <w:p>
+            <w:pPr>
+              <w:spacing w:after="40" w:before="40"/>
+            </w:pPr>
+            <w:r>
+              <w:rPr>
+                <w:rFonts w:ascii="Calibri" w:hAnsi="Calibri"/>
+                <w:b w:val="0"/>
+                <w:sz w:val="22"/>
+              </w:rPr>
+              <w:t>Ch 9</w:t>
+            </w:r>
+          </w:p>
+        </w:tc>
+        <w:tc>
+          <w:tcPr>
+            <w:tcW w:type="dxa" w:w="2484"/>
+          </w:tcPr>
+          <w:p>
+            <w:pPr>
+              <w:spacing w:after="40" w:before="40"/>
+            </w:pPr>
+            <w:r>
+              <w:rPr>
+                <w:rFonts w:ascii="Calibri" w:hAnsi="Calibri"/>
+                <w:b w:val="0"/>
+                <w:sz w:val="22"/>
+              </w:rPr>
+              <w:t>unit-02-ch9 p.1</w:t>
+            </w:r>
+          </w:p>
+        </w:tc>
+      </w:tr>
+      <w:tr>
+        <w:tc>
+          <w:tcPr>
+            <w:tcW w:type="dxa" w:w="2484"/>
+          </w:tcPr>
+          <w:p>
+            <w:pPr>
+              <w:spacing w:after="40" w:before="40"/>
+            </w:pPr>
+            <w:r>
+              <w:rPr>
+                <w:rFonts w:ascii="Calibri" w:hAnsi="Calibri"/>
+                <w:b w:val="0"/>
+                <w:sz w:val="22"/>
+              </w:rPr>
+              <w:t>21</w:t>
+            </w:r>
+          </w:p>
+        </w:tc>
+        <w:tc>
+          <w:tcPr>
+            <w:tcW w:type="dxa" w:w="2484"/>
+          </w:tcPr>
+          <w:p>
+            <w:pPr>
+              <w:spacing w:after="40" w:before="40"/>
+            </w:pPr>
+            <w:r>
+              <w:rPr>
+                <w:rFonts w:ascii="Calibri" w:hAnsi="Calibri"/>
+                <w:b w:val="0"/>
+                <w:sz w:val="22"/>
+              </w:rPr>
+              <w:t>C</w:t>
+            </w:r>
+          </w:p>
+        </w:tc>
+        <w:tc>
+          <w:tcPr>
+            <w:tcW w:type="dxa" w:w="2484"/>
+          </w:tcPr>
+          <w:p>
+            <w:pPr>
+              <w:spacing w:after="40" w:before="40"/>
+            </w:pPr>
+            <w:r>
+              <w:rPr>
+                <w:rFonts w:ascii="Calibri" w:hAnsi="Calibri"/>
+                <w:b w:val="0"/>
+                <w:sz w:val="22"/>
+              </w:rPr>
+              <w:t>Ch 1</w:t>
+            </w:r>
+          </w:p>
+        </w:tc>
+        <w:tc>
+          <w:tcPr>
+            <w:tcW w:type="dxa" w:w="2484"/>
           </w:tcPr>
           <w:p>
             <w:pPr>
@@ -1293,7 +2528,7 @@
       <w:tr>
         <w:tc>
           <w:tcPr>
-            <w:tcW w:type="dxa" w:w="3312"/>
+            <w:tcW w:type="dxa" w:w="2484"/>
           </w:tcPr>
           <w:p>
             <w:pPr>
@@ -1305,13 +2540,13 @@
                 <w:b w:val="0"/>
                 <w:sz w:val="22"/>
               </w:rPr>
-              <w:t>8</w:t>
+              <w:t>22</w:t>
             </w:r>
           </w:p>
         </w:tc>
         <w:tc>
           <w:tcPr>
-            <w:tcW w:type="dxa" w:w="3312"/>
+            <w:tcW w:type="dxa" w:w="2484"/>
           </w:tcPr>
           <w:p>
             <w:pPr>
@@ -1323,13 +2558,13 @@
                 <w:b w:val="0"/>
                 <w:sz w:val="22"/>
               </w:rPr>
-              <w:t>Ch6 p.31</w:t>
+              <w:t>A</w:t>
             </w:r>
           </w:p>
         </w:tc>
         <w:tc>
           <w:tcPr>
-            <w:tcW w:type="dxa" w:w="3312"/>
+            <w:tcW w:type="dxa" w:w="2484"/>
           </w:tcPr>
           <w:p>
             <w:pPr>
@@ -1341,15 +2576,13 @@
                 <w:b w:val="0"/>
                 <w:sz w:val="22"/>
               </w:rPr>
-              <w:t>unit-02-ch6 p.1</w:t>
+              <w:t>Ch 3</w:t>
             </w:r>
           </w:p>
         </w:tc>
-      </w:tr>
-      <w:tr>
         <w:tc>
           <w:tcPr>
-            <w:tcW w:type="dxa" w:w="3312"/>
+            <w:tcW w:type="dxa" w:w="2484"/>
           </w:tcPr>
           <w:p>
             <w:pPr>
@@ -1361,13 +2594,15 @@
                 <w:b w:val="0"/>
                 <w:sz w:val="22"/>
               </w:rPr>
-              <w:t>9</w:t>
+              <w:t>unit-02-ch3 p.3</w:t>
             </w:r>
           </w:p>
         </w:tc>
+      </w:tr>
+      <w:tr>
         <w:tc>
           <w:tcPr>
-            <w:tcW w:type="dxa" w:w="3312"/>
+            <w:tcW w:type="dxa" w:w="2484"/>
           </w:tcPr>
           <w:p>
             <w:pPr>
@@ -1379,13 +2614,49 @@
                 <w:b w:val="0"/>
                 <w:sz w:val="22"/>
               </w:rPr>
-              <w:t>Ch1 p.1</w:t>
+              <w:t>23</w:t>
             </w:r>
           </w:p>
         </w:tc>
         <w:tc>
           <w:tcPr>
-            <w:tcW w:type="dxa" w:w="3312"/>
+            <w:tcW w:type="dxa" w:w="2484"/>
+          </w:tcPr>
+          <w:p>
+            <w:pPr>
+              <w:spacing w:after="40" w:before="40"/>
+            </w:pPr>
+            <w:r>
+              <w:rPr>
+                <w:rFonts w:ascii="Calibri" w:hAnsi="Calibri"/>
+                <w:b w:val="0"/>
+                <w:sz w:val="22"/>
+              </w:rPr>
+              <w:t>B</w:t>
+            </w:r>
+          </w:p>
+        </w:tc>
+        <w:tc>
+          <w:tcPr>
+            <w:tcW w:type="dxa" w:w="2484"/>
+          </w:tcPr>
+          <w:p>
+            <w:pPr>
+              <w:spacing w:after="40" w:before="40"/>
+            </w:pPr>
+            <w:r>
+              <w:rPr>
+                <w:rFonts w:ascii="Calibri" w:hAnsi="Calibri"/>
+                <w:b w:val="0"/>
+                <w:sz w:val="22"/>
+              </w:rPr>
+              <w:t>Ch 9</w:t>
+            </w:r>
+          </w:p>
+        </w:tc>
+        <w:tc>
+          <w:tcPr>
+            <w:tcW w:type="dxa" w:w="2484"/>
           </w:tcPr>
           <w:p>
             <w:pPr>
@@ -1405,7 +2676,7 @@
       <w:tr>
         <w:tc>
           <w:tcPr>
-            <w:tcW w:type="dxa" w:w="3312"/>
+            <w:tcW w:type="dxa" w:w="2484"/>
           </w:tcPr>
           <w:p>
             <w:pPr>
@@ -1417,13 +2688,13 @@
                 <w:b w:val="0"/>
                 <w:sz w:val="22"/>
               </w:rPr>
-              <w:t>10</w:t>
+              <w:t>24</w:t>
             </w:r>
           </w:p>
         </w:tc>
         <w:tc>
           <w:tcPr>
-            <w:tcW w:type="dxa" w:w="3312"/>
+            <w:tcW w:type="dxa" w:w="2484"/>
           </w:tcPr>
           <w:p>
             <w:pPr>
@@ -1435,13 +2706,13 @@
                 <w:b w:val="0"/>
                 <w:sz w:val="22"/>
               </w:rPr>
-              <w:t>Ch2 p.2</w:t>
+              <w:t>C</w:t>
             </w:r>
           </w:p>
         </w:tc>
         <w:tc>
           <w:tcPr>
-            <w:tcW w:type="dxa" w:w="3312"/>
+            <w:tcW w:type="dxa" w:w="2484"/>
           </w:tcPr>
           <w:p>
             <w:pPr>
@@ -1453,219 +2724,13 @@
                 <w:b w:val="0"/>
                 <w:sz w:val="22"/>
               </w:rPr>
-              <w:t>unit-02-ch2 p.1</w:t>
-            </w:r>
-          </w:p>
-        </w:tc>
-      </w:tr>
-      <w:tr>
-        <w:tc>
-          <w:tcPr>
-            <w:tcW w:type="dxa" w:w="3312"/>
-          </w:tcPr>
-          <w:p>
-            <w:pPr>
-              <w:spacing w:after="40" w:before="40"/>
-            </w:pPr>
-            <w:r>
-              <w:rPr>
-                <w:rFonts w:ascii="Calibri" w:hAnsi="Calibri"/>
-                <w:b w:val="0"/>
-                <w:sz w:val="22"/>
-              </w:rPr>
-              <w:t>11</w:t>
+              <w:t>Ch 4</w:t>
             </w:r>
           </w:p>
         </w:tc>
         <w:tc>
           <w:tcPr>
-            <w:tcW w:type="dxa" w:w="3312"/>
-          </w:tcPr>
-          <w:p>
-            <w:pPr>
-              <w:spacing w:after="40" w:before="40"/>
-            </w:pPr>
-            <w:r>
-              <w:rPr>
-                <w:rFonts w:ascii="Calibri" w:hAnsi="Calibri"/>
-                <w:b w:val="0"/>
-                <w:sz w:val="22"/>
-              </w:rPr>
-              <w:t>Ch2 p.4</w:t>
-            </w:r>
-          </w:p>
-        </w:tc>
-        <w:tc>
-          <w:tcPr>
-            <w:tcW w:type="dxa" w:w="3312"/>
-          </w:tcPr>
-          <w:p>
-            <w:pPr>
-              <w:spacing w:after="40" w:before="40"/>
-            </w:pPr>
-            <w:r>
-              <w:rPr>
-                <w:rFonts w:ascii="Calibri" w:hAnsi="Calibri"/>
-                <w:b w:val="0"/>
-                <w:sz w:val="22"/>
-              </w:rPr>
-              <w:t>unit-02-ch2 p.1</w:t>
-            </w:r>
-          </w:p>
-        </w:tc>
-      </w:tr>
-      <w:tr>
-        <w:tc>
-          <w:tcPr>
-            <w:tcW w:type="dxa" w:w="3312"/>
-          </w:tcPr>
-          <w:p>
-            <w:pPr>
-              <w:spacing w:after="40" w:before="40"/>
-            </w:pPr>
-            <w:r>
-              <w:rPr>
-                <w:rFonts w:ascii="Calibri" w:hAnsi="Calibri"/>
-                <w:b w:val="0"/>
-                <w:sz w:val="22"/>
-              </w:rPr>
-              <w:t>12</w:t>
-            </w:r>
-          </w:p>
-        </w:tc>
-        <w:tc>
-          <w:tcPr>
-            <w:tcW w:type="dxa" w:w="3312"/>
-          </w:tcPr>
-          <w:p>
-            <w:pPr>
-              <w:spacing w:after="40" w:before="40"/>
-            </w:pPr>
-            <w:r>
-              <w:rPr>
-                <w:rFonts w:ascii="Calibri" w:hAnsi="Calibri"/>
-                <w:b w:val="0"/>
-                <w:sz w:val="22"/>
-              </w:rPr>
-              <w:t>Ch3 p.13</w:t>
-            </w:r>
-          </w:p>
-        </w:tc>
-        <w:tc>
-          <w:tcPr>
-            <w:tcW w:type="dxa" w:w="3312"/>
-          </w:tcPr>
-          <w:p>
-            <w:pPr>
-              <w:spacing w:after="40" w:before="40"/>
-            </w:pPr>
-            <w:r>
-              <w:rPr>
-                <w:rFonts w:ascii="Calibri" w:hAnsi="Calibri"/>
-                <w:b w:val="0"/>
-                <w:sz w:val="22"/>
-              </w:rPr>
-              <w:t>unit-02-ch3 p.2</w:t>
-            </w:r>
-          </w:p>
-        </w:tc>
-      </w:tr>
-      <w:tr>
-        <w:tc>
-          <w:tcPr>
-            <w:tcW w:type="dxa" w:w="3312"/>
-          </w:tcPr>
-          <w:p>
-            <w:pPr>
-              <w:spacing w:after="40" w:before="40"/>
-            </w:pPr>
-            <w:r>
-              <w:rPr>
-                <w:rFonts w:ascii="Calibri" w:hAnsi="Calibri"/>
-                <w:b w:val="0"/>
-                <w:sz w:val="22"/>
-              </w:rPr>
-              <w:t>13</w:t>
-            </w:r>
-          </w:p>
-        </w:tc>
-        <w:tc>
-          <w:tcPr>
-            <w:tcW w:type="dxa" w:w="3312"/>
-          </w:tcPr>
-          <w:p>
-            <w:pPr>
-              <w:spacing w:after="40" w:before="40"/>
-            </w:pPr>
-            <w:r>
-              <w:rPr>
-                <w:rFonts w:ascii="Calibri" w:hAnsi="Calibri"/>
-                <w:b w:val="0"/>
-                <w:sz w:val="22"/>
-              </w:rPr>
-              <w:t>Ch2 p.4</w:t>
-            </w:r>
-          </w:p>
-        </w:tc>
-        <w:tc>
-          <w:tcPr>
-            <w:tcW w:type="dxa" w:w="3312"/>
-          </w:tcPr>
-          <w:p>
-            <w:pPr>
-              <w:spacing w:after="40" w:before="40"/>
-            </w:pPr>
-            <w:r>
-              <w:rPr>
-                <w:rFonts w:ascii="Calibri" w:hAnsi="Calibri"/>
-                <w:b w:val="0"/>
-                <w:sz w:val="22"/>
-              </w:rPr>
-              <w:t>unit-02-ch2 p.1</w:t>
-            </w:r>
-          </w:p>
-        </w:tc>
-      </w:tr>
-      <w:tr>
-        <w:tc>
-          <w:tcPr>
-            <w:tcW w:type="dxa" w:w="3312"/>
-          </w:tcPr>
-          <w:p>
-            <w:pPr>
-              <w:spacing w:after="40" w:before="40"/>
-            </w:pPr>
-            <w:r>
-              <w:rPr>
-                <w:rFonts w:ascii="Calibri" w:hAnsi="Calibri"/>
-                <w:b w:val="0"/>
-                <w:sz w:val="22"/>
-              </w:rPr>
-              <w:t>14</w:t>
-            </w:r>
-          </w:p>
-        </w:tc>
-        <w:tc>
-          <w:tcPr>
-            <w:tcW w:type="dxa" w:w="3312"/>
-          </w:tcPr>
-          <w:p>
-            <w:pPr>
-              <w:spacing w:after="40" w:before="40"/>
-            </w:pPr>
-            <w:r>
-              <w:rPr>
-                <w:rFonts w:ascii="Calibri" w:hAnsi="Calibri"/>
-                <w:b w:val="0"/>
-                <w:sz w:val="22"/>
-              </w:rPr>
-              <w:t>Ch4 p.21</w:t>
-            </w:r>
-          </w:p>
-        </w:tc>
-        <w:tc>
-          <w:tcPr>
-            <w:tcW w:type="dxa" w:w="3312"/>
+            <w:tcW w:type="dxa" w:w="2484"/>
           </w:tcPr>
           <w:p>
             <w:pPr>
@@ -1685,567 +2750,7 @@
       <w:tr>
         <w:tc>
           <w:tcPr>
-            <w:tcW w:type="dxa" w:w="3312"/>
-          </w:tcPr>
-          <w:p>
-            <w:pPr>
-              <w:spacing w:after="40" w:before="40"/>
-            </w:pPr>
-            <w:r>
-              <w:rPr>
-                <w:rFonts w:ascii="Calibri" w:hAnsi="Calibri"/>
-                <w:b w:val="0"/>
-                <w:sz w:val="22"/>
-              </w:rPr>
-              <w:t>15</w:t>
-            </w:r>
-          </w:p>
-        </w:tc>
-        <w:tc>
-          <w:tcPr>
-            <w:tcW w:type="dxa" w:w="3312"/>
-          </w:tcPr>
-          <w:p>
-            <w:pPr>
-              <w:spacing w:after="40" w:before="40"/>
-            </w:pPr>
-            <w:r>
-              <w:rPr>
-                <w:rFonts w:ascii="Calibri" w:hAnsi="Calibri"/>
-                <w:b w:val="0"/>
-                <w:sz w:val="22"/>
-              </w:rPr>
-              <w:t>Ch4 p.22</w:t>
-            </w:r>
-          </w:p>
-        </w:tc>
-        <w:tc>
-          <w:tcPr>
-            <w:tcW w:type="dxa" w:w="3312"/>
-          </w:tcPr>
-          <w:p>
-            <w:pPr>
-              <w:spacing w:after="40" w:before="40"/>
-            </w:pPr>
-            <w:r>
-              <w:rPr>
-                <w:rFonts w:ascii="Calibri" w:hAnsi="Calibri"/>
-                <w:b w:val="0"/>
-                <w:sz w:val="22"/>
-              </w:rPr>
-              <w:t>unit-02-ch4 p.1</w:t>
-            </w:r>
-          </w:p>
-        </w:tc>
-      </w:tr>
-      <w:tr>
-        <w:tc>
-          <w:tcPr>
-            <w:tcW w:type="dxa" w:w="3312"/>
-          </w:tcPr>
-          <w:p>
-            <w:pPr>
-              <w:spacing w:after="40" w:before="40"/>
-            </w:pPr>
-            <w:r>
-              <w:rPr>
-                <w:rFonts w:ascii="Calibri" w:hAnsi="Calibri"/>
-                <w:b w:val="0"/>
-                <w:sz w:val="22"/>
-              </w:rPr>
-              <w:t>16</w:t>
-            </w:r>
-          </w:p>
-        </w:tc>
-        <w:tc>
-          <w:tcPr>
-            <w:tcW w:type="dxa" w:w="3312"/>
-          </w:tcPr>
-          <w:p>
-            <w:pPr>
-              <w:spacing w:after="40" w:before="40"/>
-            </w:pPr>
-            <w:r>
-              <w:rPr>
-                <w:rFonts w:ascii="Calibri" w:hAnsi="Calibri"/>
-                <w:b w:val="0"/>
-                <w:sz w:val="22"/>
-              </w:rPr>
-              <w:t>Ch5 p.28</w:t>
-            </w:r>
-          </w:p>
-        </w:tc>
-        <w:tc>
-          <w:tcPr>
-            <w:tcW w:type="dxa" w:w="3312"/>
-          </w:tcPr>
-          <w:p>
-            <w:pPr>
-              <w:spacing w:after="40" w:before="40"/>
-            </w:pPr>
-            <w:r>
-              <w:rPr>
-                <w:rFonts w:ascii="Calibri" w:hAnsi="Calibri"/>
-                <w:b w:val="0"/>
-                <w:sz w:val="22"/>
-              </w:rPr>
-              <w:t>unit-02-ch5 p.1</w:t>
-            </w:r>
-          </w:p>
-        </w:tc>
-      </w:tr>
-      <w:tr>
-        <w:tc>
-          <w:tcPr>
-            <w:tcW w:type="dxa" w:w="3312"/>
-          </w:tcPr>
-          <w:p>
-            <w:pPr>
-              <w:spacing w:after="40" w:before="40"/>
-            </w:pPr>
-            <w:r>
-              <w:rPr>
-                <w:rFonts w:ascii="Calibri" w:hAnsi="Calibri"/>
-                <w:b w:val="0"/>
-                <w:sz w:val="22"/>
-              </w:rPr>
-              <w:t>17</w:t>
-            </w:r>
-          </w:p>
-        </w:tc>
-        <w:tc>
-          <w:tcPr>
-            <w:tcW w:type="dxa" w:w="3312"/>
-          </w:tcPr>
-          <w:p>
-            <w:pPr>
-              <w:spacing w:after="40" w:before="40"/>
-            </w:pPr>
-            <w:r>
-              <w:rPr>
-                <w:rFonts w:ascii="Calibri" w:hAnsi="Calibri"/>
-                <w:b w:val="0"/>
-                <w:sz w:val="22"/>
-              </w:rPr>
-              <w:t>Ch5 p.29</w:t>
-            </w:r>
-          </w:p>
-        </w:tc>
-        <w:tc>
-          <w:tcPr>
-            <w:tcW w:type="dxa" w:w="3312"/>
-          </w:tcPr>
-          <w:p>
-            <w:pPr>
-              <w:spacing w:after="40" w:before="40"/>
-            </w:pPr>
-            <w:r>
-              <w:rPr>
-                <w:rFonts w:ascii="Calibri" w:hAnsi="Calibri"/>
-                <w:b w:val="0"/>
-                <w:sz w:val="22"/>
-              </w:rPr>
-              <w:t>unit-02-ch5 p.2</w:t>
-            </w:r>
-          </w:p>
-        </w:tc>
-      </w:tr>
-      <w:tr>
-        <w:tc>
-          <w:tcPr>
-            <w:tcW w:type="dxa" w:w="3312"/>
-          </w:tcPr>
-          <w:p>
-            <w:pPr>
-              <w:spacing w:after="40" w:before="40"/>
-            </w:pPr>
-            <w:r>
-              <w:rPr>
-                <w:rFonts w:ascii="Calibri" w:hAnsi="Calibri"/>
-                <w:b w:val="0"/>
-                <w:sz w:val="22"/>
-              </w:rPr>
-              <w:t>18</w:t>
-            </w:r>
-          </w:p>
-        </w:tc>
-        <w:tc>
-          <w:tcPr>
-            <w:tcW w:type="dxa" w:w="3312"/>
-          </w:tcPr>
-          <w:p>
-            <w:pPr>
-              <w:spacing w:after="40" w:before="40"/>
-            </w:pPr>
-            <w:r>
-              <w:rPr>
-                <w:rFonts w:ascii="Calibri" w:hAnsi="Calibri"/>
-                <w:b w:val="0"/>
-                <w:sz w:val="22"/>
-              </w:rPr>
-              <w:t>Ch6 p.31</w:t>
-            </w:r>
-          </w:p>
-        </w:tc>
-        <w:tc>
-          <w:tcPr>
-            <w:tcW w:type="dxa" w:w="3312"/>
-          </w:tcPr>
-          <w:p>
-            <w:pPr>
-              <w:spacing w:after="40" w:before="40"/>
-            </w:pPr>
-            <w:r>
-              <w:rPr>
-                <w:rFonts w:ascii="Calibri" w:hAnsi="Calibri"/>
-                <w:b w:val="0"/>
-                <w:sz w:val="22"/>
-              </w:rPr>
-              <w:t>unit-02-ch6 p.1</w:t>
-            </w:r>
-          </w:p>
-        </w:tc>
-      </w:tr>
-      <w:tr>
-        <w:tc>
-          <w:tcPr>
-            <w:tcW w:type="dxa" w:w="3312"/>
-          </w:tcPr>
-          <w:p>
-            <w:pPr>
-              <w:spacing w:after="40" w:before="40"/>
-            </w:pPr>
-            <w:r>
-              <w:rPr>
-                <w:rFonts w:ascii="Calibri" w:hAnsi="Calibri"/>
-                <w:b w:val="0"/>
-                <w:sz w:val="22"/>
-              </w:rPr>
-              <w:t>19</w:t>
-            </w:r>
-          </w:p>
-        </w:tc>
-        <w:tc>
-          <w:tcPr>
-            <w:tcW w:type="dxa" w:w="3312"/>
-          </w:tcPr>
-          <w:p>
-            <w:pPr>
-              <w:spacing w:after="40" w:before="40"/>
-            </w:pPr>
-            <w:r>
-              <w:rPr>
-                <w:rFonts w:ascii="Calibri" w:hAnsi="Calibri"/>
-                <w:b w:val="0"/>
-                <w:sz w:val="22"/>
-              </w:rPr>
-              <w:t>Ch6 p.33</w:t>
-            </w:r>
-          </w:p>
-        </w:tc>
-        <w:tc>
-          <w:tcPr>
-            <w:tcW w:type="dxa" w:w="3312"/>
-          </w:tcPr>
-          <w:p>
-            <w:pPr>
-              <w:spacing w:after="40" w:before="40"/>
-            </w:pPr>
-            <w:r>
-              <w:rPr>
-                <w:rFonts w:ascii="Calibri" w:hAnsi="Calibri"/>
-                <w:b w:val="0"/>
-                <w:sz w:val="22"/>
-              </w:rPr>
-              <w:t>unit-02-ch6 p.2</w:t>
-            </w:r>
-          </w:p>
-        </w:tc>
-      </w:tr>
-      <w:tr>
-        <w:tc>
-          <w:tcPr>
-            <w:tcW w:type="dxa" w:w="3312"/>
-          </w:tcPr>
-          <w:p>
-            <w:pPr>
-              <w:spacing w:after="40" w:before="40"/>
-            </w:pPr>
-            <w:r>
-              <w:rPr>
-                <w:rFonts w:ascii="Calibri" w:hAnsi="Calibri"/>
-                <w:b w:val="0"/>
-                <w:sz w:val="22"/>
-              </w:rPr>
-              <w:t>20</w:t>
-            </w:r>
-          </w:p>
-        </w:tc>
-        <w:tc>
-          <w:tcPr>
-            <w:tcW w:type="dxa" w:w="3312"/>
-          </w:tcPr>
-          <w:p>
-            <w:pPr>
-              <w:spacing w:after="40" w:before="40"/>
-            </w:pPr>
-            <w:r>
-              <w:rPr>
-                <w:rFonts w:ascii="Calibri" w:hAnsi="Calibri"/>
-                <w:b w:val="0"/>
-                <w:sz w:val="22"/>
-              </w:rPr>
-              <w:t>Ch7 p.37</w:t>
-            </w:r>
-          </w:p>
-        </w:tc>
-        <w:tc>
-          <w:tcPr>
-            <w:tcW w:type="dxa" w:w="3312"/>
-          </w:tcPr>
-          <w:p>
-            <w:pPr>
-              <w:spacing w:after="40" w:before="40"/>
-            </w:pPr>
-            <w:r>
-              <w:rPr>
-                <w:rFonts w:ascii="Calibri" w:hAnsi="Calibri"/>
-                <w:b w:val="0"/>
-                <w:sz w:val="22"/>
-              </w:rPr>
-              <w:t>unit-02-ch7 p.1</w:t>
-            </w:r>
-          </w:p>
-        </w:tc>
-      </w:tr>
-      <w:tr>
-        <w:tc>
-          <w:tcPr>
-            <w:tcW w:type="dxa" w:w="3312"/>
-          </w:tcPr>
-          <w:p>
-            <w:pPr>
-              <w:spacing w:after="40" w:before="40"/>
-            </w:pPr>
-            <w:r>
-              <w:rPr>
-                <w:rFonts w:ascii="Calibri" w:hAnsi="Calibri"/>
-                <w:b w:val="0"/>
-                <w:sz w:val="22"/>
-              </w:rPr>
-              <w:t>21</w:t>
-            </w:r>
-          </w:p>
-        </w:tc>
-        <w:tc>
-          <w:tcPr>
-            <w:tcW w:type="dxa" w:w="3312"/>
-          </w:tcPr>
-          <w:p>
-            <w:pPr>
-              <w:spacing w:after="40" w:before="40"/>
-            </w:pPr>
-            <w:r>
-              <w:rPr>
-                <w:rFonts w:ascii="Calibri" w:hAnsi="Calibri"/>
-                <w:b w:val="0"/>
-                <w:sz w:val="22"/>
-              </w:rPr>
-              <w:t>Ch7 p.38</w:t>
-            </w:r>
-          </w:p>
-        </w:tc>
-        <w:tc>
-          <w:tcPr>
-            <w:tcW w:type="dxa" w:w="3312"/>
-          </w:tcPr>
-          <w:p>
-            <w:pPr>
-              <w:spacing w:after="40" w:before="40"/>
-            </w:pPr>
-            <w:r>
-              <w:rPr>
-                <w:rFonts w:ascii="Calibri" w:hAnsi="Calibri"/>
-                <w:b w:val="0"/>
-                <w:sz w:val="22"/>
-              </w:rPr>
-              <w:t>unit-02-ch7 p.2</w:t>
-            </w:r>
-          </w:p>
-        </w:tc>
-      </w:tr>
-      <w:tr>
-        <w:tc>
-          <w:tcPr>
-            <w:tcW w:type="dxa" w:w="3312"/>
-          </w:tcPr>
-          <w:p>
-            <w:pPr>
-              <w:spacing w:after="40" w:before="40"/>
-            </w:pPr>
-            <w:r>
-              <w:rPr>
-                <w:rFonts w:ascii="Calibri" w:hAnsi="Calibri"/>
-                <w:b w:val="0"/>
-                <w:sz w:val="22"/>
-              </w:rPr>
-              <w:t>22</w:t>
-            </w:r>
-          </w:p>
-        </w:tc>
-        <w:tc>
-          <w:tcPr>
-            <w:tcW w:type="dxa" w:w="3312"/>
-          </w:tcPr>
-          <w:p>
-            <w:pPr>
-              <w:spacing w:after="40" w:before="40"/>
-            </w:pPr>
-            <w:r>
-              <w:rPr>
-                <w:rFonts w:ascii="Calibri" w:hAnsi="Calibri"/>
-                <w:b w:val="0"/>
-                <w:sz w:val="22"/>
-              </w:rPr>
-              <w:t>Ch8 p.43</w:t>
-            </w:r>
-          </w:p>
-        </w:tc>
-        <w:tc>
-          <w:tcPr>
-            <w:tcW w:type="dxa" w:w="3312"/>
-          </w:tcPr>
-          <w:p>
-            <w:pPr>
-              <w:spacing w:after="40" w:before="40"/>
-            </w:pPr>
-            <w:r>
-              <w:rPr>
-                <w:rFonts w:ascii="Calibri" w:hAnsi="Calibri"/>
-                <w:b w:val="0"/>
-                <w:sz w:val="22"/>
-              </w:rPr>
-              <w:t>unit-02-ch8 p.1</w:t>
-            </w:r>
-          </w:p>
-        </w:tc>
-      </w:tr>
-      <w:tr>
-        <w:tc>
-          <w:tcPr>
-            <w:tcW w:type="dxa" w:w="3312"/>
-          </w:tcPr>
-          <w:p>
-            <w:pPr>
-              <w:spacing w:after="40" w:before="40"/>
-            </w:pPr>
-            <w:r>
-              <w:rPr>
-                <w:rFonts w:ascii="Calibri" w:hAnsi="Calibri"/>
-                <w:b w:val="0"/>
-                <w:sz w:val="22"/>
-              </w:rPr>
-              <w:t>23</w:t>
-            </w:r>
-          </w:p>
-        </w:tc>
-        <w:tc>
-          <w:tcPr>
-            <w:tcW w:type="dxa" w:w="3312"/>
-          </w:tcPr>
-          <w:p>
-            <w:pPr>
-              <w:spacing w:after="40" w:before="40"/>
-            </w:pPr>
-            <w:r>
-              <w:rPr>
-                <w:rFonts w:ascii="Calibri" w:hAnsi="Calibri"/>
-                <w:b w:val="0"/>
-                <w:sz w:val="22"/>
-              </w:rPr>
-              <w:t>Ch8 p.44</w:t>
-            </w:r>
-          </w:p>
-        </w:tc>
-        <w:tc>
-          <w:tcPr>
-            <w:tcW w:type="dxa" w:w="3312"/>
-          </w:tcPr>
-          <w:p>
-            <w:pPr>
-              <w:spacing w:after="40" w:before="40"/>
-            </w:pPr>
-            <w:r>
-              <w:rPr>
-                <w:rFonts w:ascii="Calibri" w:hAnsi="Calibri"/>
-                <w:b w:val="0"/>
-                <w:sz w:val="22"/>
-              </w:rPr>
-              <w:t>unit-02-ch8 p.2</w:t>
-            </w:r>
-          </w:p>
-        </w:tc>
-      </w:tr>
-      <w:tr>
-        <w:tc>
-          <w:tcPr>
-            <w:tcW w:type="dxa" w:w="3312"/>
-          </w:tcPr>
-          <w:p>
-            <w:pPr>
-              <w:spacing w:after="40" w:before="40"/>
-            </w:pPr>
-            <w:r>
-              <w:rPr>
-                <w:rFonts w:ascii="Calibri" w:hAnsi="Calibri"/>
-                <w:b w:val="0"/>
-                <w:sz w:val="22"/>
-              </w:rPr>
-              <w:t>24</w:t>
-            </w:r>
-          </w:p>
-        </w:tc>
-        <w:tc>
-          <w:tcPr>
-            <w:tcW w:type="dxa" w:w="3312"/>
-          </w:tcPr>
-          <w:p>
-            <w:pPr>
-              <w:spacing w:after="40" w:before="40"/>
-            </w:pPr>
-            <w:r>
-              <w:rPr>
-                <w:rFonts w:ascii="Calibri" w:hAnsi="Calibri"/>
-                <w:b w:val="0"/>
-                <w:sz w:val="22"/>
-              </w:rPr>
-              <w:t>Ch9 p.49</w:t>
-            </w:r>
-          </w:p>
-        </w:tc>
-        <w:tc>
-          <w:tcPr>
-            <w:tcW w:type="dxa" w:w="3312"/>
-          </w:tcPr>
-          <w:p>
-            <w:pPr>
-              <w:spacing w:after="40" w:before="40"/>
-            </w:pPr>
-            <w:r>
-              <w:rPr>
-                <w:rFonts w:ascii="Calibri" w:hAnsi="Calibri"/>
-                <w:b w:val="0"/>
-                <w:sz w:val="22"/>
-              </w:rPr>
-              <w:t>unit-02-ch9 p.2</w:t>
-            </w:r>
-          </w:p>
-        </w:tc>
-      </w:tr>
-      <w:tr>
-        <w:tc>
-          <w:tcPr>
-            <w:tcW w:type="dxa" w:w="3312"/>
+            <w:tcW w:type="dxa" w:w="2484"/>
           </w:tcPr>
           <w:p>
             <w:pPr>
@@ -2263,7 +2768,7 @@
         </w:tc>
         <w:tc>
           <w:tcPr>
-            <w:tcW w:type="dxa" w:w="3312"/>
+            <w:tcW w:type="dxa" w:w="2484"/>
           </w:tcPr>
           <w:p>
             <w:pPr>
@@ -2275,13 +2780,13 @@
                 <w:b w:val="0"/>
                 <w:sz w:val="22"/>
               </w:rPr>
-              <w:t>Ch7 p.38</w:t>
+              <w:t>D</w:t>
             </w:r>
           </w:p>
         </w:tc>
         <w:tc>
           <w:tcPr>
-            <w:tcW w:type="dxa" w:w="3312"/>
+            <w:tcW w:type="dxa" w:w="2484"/>
           </w:tcPr>
           <w:p>
             <w:pPr>
@@ -2293,7 +2798,25 @@
                 <w:b w:val="0"/>
                 <w:sz w:val="22"/>
               </w:rPr>
-              <w:t>unit-02-ch7 p.2</w:t>
+              <w:t>Ch 5</w:t>
+            </w:r>
+          </w:p>
+        </w:tc>
+        <w:tc>
+          <w:tcPr>
+            <w:tcW w:type="dxa" w:w="2484"/>
+          </w:tcPr>
+          <w:p>
+            <w:pPr>
+              <w:spacing w:after="40" w:before="40"/>
+            </w:pPr>
+            <w:r>
+              <w:rPr>
+                <w:rFonts w:ascii="Calibri" w:hAnsi="Calibri"/>
+                <w:b w:val="0"/>
+                <w:sz w:val="22"/>
+              </w:rPr>
+              <w:t>unit-02-ch5 p.2</w:t>
             </w:r>
           </w:p>
         </w:tc>

</xml_diff>